<commit_message>
docs: add DeepLabCut install requirement to README and CUBE_GUIDE
</commit_message>
<xml_diff>
--- a/CUBE_Complete_Guide.docx
+++ b/CUBE_Complete_Guide.docx
@@ -696,35 +696,44 @@
         <w:br/>
         <w:t>conda activate CUBE</w:t>
         <w:br/>
-        <w:t>pip install pillow opencv-python-headless scipy scikit-learn umap-learn customtkinter plotly hmmlearn</w:t>
+        <w:t>pip install pillow opencv-python-headless scipy scikit-learn umap-learn customtkinter plotly hmmlearn deeplabcut</w:t>
         <w:br/>
         <w:t>conda install -c conda-forge hdbscan</w:t>
       </w:r>
     </w:p>
     <w:p>
       <w:pPr>
-        <w:spacing w:after="120"/>
-      </w:pPr>
-      <w:r>
-        <w:rPr>
-          <w:b w:val="0"/>
-          <w:i w:val="0"/>
-        </w:rPr>
-        <w:t>DeepLabCut (for Step 1 inference only):</w:t>
-      </w:r>
-    </w:p>
-    <w:p>
-      <w:pPr>
-        <w:spacing w:before="80" w:after="120"/>
-        <w:ind w:left="360" w:right="360"/>
-        <w:shd w:fill="F0F0F0" w:val="clear"/>
-      </w:pPr>
+        <w:pStyle w:val="IntenseQuote"/>
+        <w:spacing w:before="80" w:after="80"/>
+      </w:pPr>
+      <w:r>
+        <w:rPr>
+          <w:b/>
+          <w:i/>
+        </w:rPr>
+        <w:t>Important:</w:t>
+      </w:r>
+      <w:r>
+        <w:rPr>
+          <w:b w:val="0"/>
+          <w:i/>
+        </w:rPr>
+        <w:t xml:space="preserve"> DeepLabCut must be installed inside the </w:t>
+      </w:r>
       <w:r>
         <w:rPr>
           <w:rFonts w:ascii="Courier New" w:hAnsi="Courier New"/>
-          <w:sz w:val="17"/>
-        </w:rPr>
-        <w:t>pip install deeplabcut[gui]</w:t>
+          <w:color w:val="C0392B"/>
+          <w:sz w:val="18"/>
+        </w:rPr>
+        <w:t>CUBE</w:t>
+      </w:r>
+      <w:r>
+        <w:rPr>
+          <w:b w:val="0"/>
+          <w:i/>
+        </w:rPr>
+        <w:t xml:space="preserve"> environment — not in a separate environment. Step 1 (DLC inference) will fail if DeepLabCut is absent or installed elsewhere. Steps 2–5 do not require it.</w:t>
       </w:r>
     </w:p>
     <w:p>

</xml_diff>

<commit_message>
docs(v6-kinematics): implementation report, README/CUBE_GUIDE/CLAUDE.md updates, docx regen
</commit_message>
<xml_diff>
--- a/CUBE_Complete_Guide.docx
+++ b/CUBE_Complete_Guide.docx
@@ -6812,6 +6812,14 @@
         <w:t xml:space="preserve">    &lt;stem&gt;_bout_lengths.csv          ← MLP bout table (preferred: _hmm version)</w:t>
         <w:br/>
         <w:t xml:space="preserve">    &lt;stem&gt;_bout_lengths_hmm.csv      ← HMM-smoothed bouts (used by analyser by default)</w:t>
+        <w:br/>
+        <w:t xml:space="preserve">    &lt;stem&gt;_bout_lengths_hmm_enriched.csv  ← (if kinematic_directedness_enabled, off by default)</w:t>
+        <w:br/>
+        <w:t xml:space="preserve">                                             canonical 3 columns + net_displacement_px,</w:t>
+        <w:br/>
+        <w:t xml:space="preserve">                                             path_length_px, straightness_ratio,</w:t>
+        <w:br/>
+        <w:t xml:space="preserve">                                             mean_speed_px_s, heading_consistency</w:t>
         <w:br/>
         <w:t xml:space="preserve">    &lt;stem&gt;_frame_labels.csv          ← per-frame: frame, time_s, label</w:t>
         <w:br/>
@@ -14121,6 +14129,427 @@
           <w:i w:val="0"/>
         </w:rPr>
         <w:t xml:space="preserve"> (mean co-association within clusters vs. between clusters) instead; validated real-data runs saw 3–14×.</w:t>
+      </w:r>
+    </w:p>
+    <w:p>
+      <w:pPr>
+        <w:pStyle w:val="Heading3"/>
+        <w:spacing w:before="160" w:after="80"/>
+      </w:pPr>
+      <w:r>
+        <w:rPr>
+          <w:b/>
+          <w:color w:val="1F497D"/>
+          <w:sz w:val="24"/>
+        </w:rPr>
+        <w:t>Kinematic Directedness (opt-in, v6)</w:t>
+      </w:r>
+    </w:p>
+    <w:p>
+      <w:pPr>
+        <w:pStyle w:val="ListBullet"/>
+      </w:pPr>
+      <w:r>
+        <w:rPr>
+          <w:rFonts w:ascii="Courier New" w:hAnsi="Courier New"/>
+          <w:color w:val="C0392B"/>
+          <w:sz w:val="18"/>
+        </w:rPr>
+        <w:t>kinematic_directedness_enabled</w:t>
+      </w:r>
+      <w:r>
+        <w:rPr>
+          <w:b w:val="0"/>
+          <w:i w:val="0"/>
+          <w:sz w:val="21"/>
+        </w:rPr>
+        <w:t xml:space="preserve"> — </w:t>
+      </w:r>
+      <w:r>
+        <w:rPr>
+          <w:rFonts w:ascii="Courier New" w:hAnsi="Courier New"/>
+          <w:color w:val="C0392B"/>
+          <w:sz w:val="18"/>
+        </w:rPr>
+        <w:t>False</w:t>
+      </w:r>
+      <w:r>
+        <w:rPr>
+          <w:b w:val="0"/>
+          <w:i w:val="0"/>
+          <w:sz w:val="21"/>
+        </w:rPr>
+        <w:t xml:space="preserve"> (default, opt-in only, and never auto-enabled — this changes</w:t>
+      </w:r>
+    </w:p>
+    <w:p>
+      <w:pPr>
+        <w:spacing w:after="120"/>
+      </w:pPr>
+      <w:r>
+        <w:rPr>
+          <w:b w:val="0"/>
+          <w:i w:val="0"/>
+        </w:rPr>
+        <w:t xml:space="preserve">visible output schema, so unlike </w:t>
+      </w:r>
+      <w:r>
+        <w:rPr>
+          <w:rFonts w:ascii="Courier New" w:hAnsi="Courier New"/>
+          <w:color w:val="C0392B"/>
+          <w:sz w:val="18"/>
+        </w:rPr>
+        <w:t>consensus_clustering_enabled</w:t>
+      </w:r>
+      <w:r>
+        <w:rPr>
+          <w:b w:val="0"/>
+          <w:i w:val="0"/>
+        </w:rPr>
+        <w:t xml:space="preserve">'s auto-threshold trigger it never flips itself on based on data characteristics). Set </w:t>
+      </w:r>
+      <w:r>
+        <w:rPr>
+          <w:rFonts w:ascii="Courier New" w:hAnsi="Courier New"/>
+          <w:color w:val="C0392B"/>
+          <w:sz w:val="18"/>
+        </w:rPr>
+        <w:t>True</w:t>
+      </w:r>
+      <w:r>
+        <w:rPr>
+          <w:b w:val="0"/>
+          <w:i w:val="0"/>
+        </w:rPr>
+        <w:t xml:space="preserve"> to write an additional per-session sidecar CSV, </w:t>
+      </w:r>
+      <w:r>
+        <w:rPr>
+          <w:rFonts w:ascii="Courier New" w:hAnsi="Courier New"/>
+          <w:color w:val="C0392B"/>
+          <w:sz w:val="18"/>
+        </w:rPr>
+        <w:t>&lt;stem&gt;_bout_lengths_hmm_enriched.csv</w:t>
+      </w:r>
+      <w:r>
+        <w:rPr>
+          <w:b w:val="0"/>
+          <w:i w:val="0"/>
+        </w:rPr>
+        <w:t xml:space="preserve">, alongside the canonical </w:t>
+      </w:r>
+      <w:r>
+        <w:rPr>
+          <w:rFonts w:ascii="Courier New" w:hAnsi="Courier New"/>
+          <w:color w:val="C0392B"/>
+          <w:sz w:val="18"/>
+        </w:rPr>
+        <w:t>*_bout_lengths_hmm.csv</w:t>
+      </w:r>
+      <w:r>
+        <w:rPr>
+          <w:b w:val="0"/>
+          <w:i w:val="0"/>
+        </w:rPr>
+        <w:t xml:space="preserve"> (which is never itself modified, in either state of this flag).</w:t>
+      </w:r>
+    </w:p>
+    <w:p>
+      <w:pPr>
+        <w:pStyle w:val="ListBullet"/>
+      </w:pPr>
+      <w:r>
+        <w:rPr>
+          <w:b w:val="0"/>
+          <w:i w:val="0"/>
+          <w:sz w:val="21"/>
+        </w:rPr>
+        <w:t>The sidecar repeats the canonical 3 columns (for self-contained joinability) plus 5 new per-bout columns:</w:t>
+      </w:r>
+    </w:p>
+    <w:p>
+      <w:pPr>
+        <w:spacing w:after="120"/>
+      </w:pPr>
+      <w:r>
+        <w:rPr>
+          <w:rFonts w:ascii="Courier New" w:hAnsi="Courier New"/>
+          <w:color w:val="C0392B"/>
+          <w:sz w:val="18"/>
+        </w:rPr>
+        <w:t>net_displacement_px</w:t>
+      </w:r>
+      <w:r>
+        <w:rPr>
+          <w:b w:val="0"/>
+          <w:i w:val="0"/>
+        </w:rPr>
+        <w:t xml:space="preserve"> (straight-line distance from the bout's first to last frame), </w:t>
+      </w:r>
+      <w:r>
+        <w:rPr>
+          <w:rFonts w:ascii="Courier New" w:hAnsi="Courier New"/>
+          <w:color w:val="C0392B"/>
+          <w:sz w:val="18"/>
+        </w:rPr>
+        <w:t>path_length_px</w:t>
+      </w:r>
+      <w:r>
+        <w:rPr>
+          <w:b w:val="0"/>
+          <w:i w:val="0"/>
+        </w:rPr>
+        <w:t xml:space="preserve"> (summed frame-to-frame travel distance), </w:t>
+      </w:r>
+      <w:r>
+        <w:rPr>
+          <w:rFonts w:ascii="Courier New" w:hAnsi="Courier New"/>
+          <w:color w:val="C0392B"/>
+          <w:sz w:val="18"/>
+        </w:rPr>
+        <w:t>straightness_ratio</w:t>
+      </w:r>
+      <w:r>
+        <w:rPr>
+          <w:b w:val="0"/>
+          <w:i w:val="0"/>
+        </w:rPr>
+        <w:t xml:space="preserve"> (net ÷ path — 1.0 = perfectly straight movement, near 0 = meandering or returning close to the start), </w:t>
+      </w:r>
+      <w:r>
+        <w:rPr>
+          <w:rFonts w:ascii="Courier New" w:hAnsi="Courier New"/>
+          <w:color w:val="C0392B"/>
+          <w:sz w:val="18"/>
+        </w:rPr>
+        <w:t>mean_speed_px_s</w:t>
+      </w:r>
+      <w:r>
+        <w:rPr>
+          <w:b w:val="0"/>
+          <w:i w:val="0"/>
+        </w:rPr>
+        <w:t xml:space="preserve">, and </w:t>
+      </w:r>
+      <w:r>
+        <w:rPr>
+          <w:rFonts w:ascii="Courier New" w:hAnsi="Courier New"/>
+          <w:color w:val="C0392B"/>
+          <w:sz w:val="18"/>
+        </w:rPr>
+        <w:t>heading_consistency</w:t>
+      </w:r>
+      <w:r>
+        <w:rPr>
+          <w:b w:val="0"/>
+          <w:i w:val="0"/>
+        </w:rPr>
+        <w:t xml:space="preserve"> (mean resultant length of the bout's unit step-heading vectors — 1.0 = every step points the same direction, near 0 = directionally random). Bouts shorter than 5 frames skip </w:t>
+      </w:r>
+      <w:r>
+        <w:rPr>
+          <w:rFonts w:ascii="Courier New" w:hAnsi="Courier New"/>
+          <w:color w:val="C0392B"/>
+          <w:sz w:val="18"/>
+        </w:rPr>
+        <w:t>straightness_ratio</w:t>
+      </w:r>
+      <w:r>
+        <w:rPr>
+          <w:b w:val="0"/>
+          <w:i w:val="0"/>
+        </w:rPr>
+        <w:t>/</w:t>
+      </w:r>
+      <w:r>
+        <w:rPr>
+          <w:rFonts w:ascii="Courier New" w:hAnsi="Courier New"/>
+          <w:color w:val="C0392B"/>
+          <w:sz w:val="18"/>
+        </w:rPr>
+        <w:t>heading_consistency</w:t>
+      </w:r>
+      <w:r>
+        <w:rPr>
+          <w:b w:val="0"/>
+          <w:i w:val="0"/>
+        </w:rPr>
+        <w:t xml:space="preserve"> (</w:t>
+      </w:r>
+      <w:r>
+        <w:rPr>
+          <w:rFonts w:ascii="Courier New" w:hAnsi="Courier New"/>
+          <w:color w:val="C0392B"/>
+          <w:sz w:val="18"/>
+        </w:rPr>
+        <w:t>NaN</w:t>
+      </w:r>
+      <w:r>
+        <w:rPr>
+          <w:b w:val="0"/>
+          <w:i w:val="0"/>
+        </w:rPr>
+        <w:t>) since both are noisy or undefined on very short bouts; the other three columns remain well-defined at any bout length.</w:t>
+      </w:r>
+    </w:p>
+    <w:p>
+      <w:pPr>
+        <w:pStyle w:val="ListBullet"/>
+      </w:pPr>
+      <w:r>
+        <w:rPr>
+          <w:b w:val="0"/>
+          <w:i w:val="0"/>
+          <w:sz w:val="21"/>
+        </w:rPr>
+        <w:t xml:space="preserve">When left at its default </w:t>
+      </w:r>
+      <w:r>
+        <w:rPr>
+          <w:rFonts w:ascii="Courier New" w:hAnsi="Courier New"/>
+          <w:color w:val="C0392B"/>
+          <w:sz w:val="18"/>
+        </w:rPr>
+        <w:t>False</w:t>
+      </w:r>
+      <w:r>
+        <w:rPr>
+          <w:b w:val="0"/>
+          <w:i w:val="0"/>
+          <w:sz w:val="21"/>
+        </w:rPr>
+        <w:t>, no sidecar file is written at all (not written empty) — verified</w:t>
+      </w:r>
+    </w:p>
+    <w:p>
+      <w:pPr>
+        <w:spacing w:after="120"/>
+      </w:pPr>
+      <w:r>
+        <w:rPr>
+          <w:b w:val="0"/>
+          <w:i w:val="0"/>
+        </w:rPr>
+        <w:t>byte-identical output for every existing file in both states of the flag.</w:t>
+      </w:r>
+    </w:p>
+    <w:p>
+      <w:pPr>
+        <w:pStyle w:val="ListBullet"/>
+      </w:pPr>
+      <w:r>
+        <w:rPr>
+          <w:rFonts w:ascii="Courier New" w:hAnsi="Courier New"/>
+          <w:color w:val="C0392B"/>
+          <w:sz w:val="18"/>
+        </w:rPr>
+        <w:t>predict_from_saved_model</w:t>
+      </w:r>
+      <w:r>
+        <w:rPr>
+          <w:b w:val="0"/>
+          <w:i w:val="0"/>
+          <w:sz w:val="21"/>
+        </w:rPr>
+        <w:t xml:space="preserve"> (running an already-trained model on new sessions without retraining) also</w:t>
+      </w:r>
+    </w:p>
+    <w:p>
+      <w:pPr>
+        <w:spacing w:after="120"/>
+      </w:pPr>
+      <w:r>
+        <w:rPr>
+          <w:b w:val="0"/>
+          <w:i w:val="0"/>
+        </w:rPr>
+        <w:t xml:space="preserve">honors this flag from the saved model's own config. That path has no HMM-smoothed bout variant at all, so its sidecar is named </w:t>
+      </w:r>
+      <w:r>
+        <w:rPr>
+          <w:rFonts w:ascii="Courier New" w:hAnsi="Courier New"/>
+          <w:color w:val="C0392B"/>
+          <w:sz w:val="18"/>
+        </w:rPr>
+        <w:t>&lt;stem&gt;_bout_lengths_enriched.csv</w:t>
+      </w:r>
+      <w:r>
+        <w:rPr>
+          <w:b w:val="0"/>
+          <w:i w:val="0"/>
+        </w:rPr>
+        <w:t xml:space="preserve"> (no </w:t>
+      </w:r>
+      <w:r>
+        <w:rPr>
+          <w:rFonts w:ascii="Courier New" w:hAnsi="Courier New"/>
+          <w:color w:val="C0392B"/>
+          <w:sz w:val="18"/>
+        </w:rPr>
+        <w:t>_hmm</w:t>
+      </w:r>
+      <w:r>
+        <w:rPr>
+          <w:b w:val="0"/>
+          <w:i w:val="0"/>
+        </w:rPr>
+        <w:t>), pairing with the raw bout CSV it actually produces.</w:t>
+      </w:r>
+    </w:p>
+    <w:p>
+      <w:pPr>
+        <w:pStyle w:val="ListBullet"/>
+      </w:pPr>
+      <w:r>
+        <w:rPr>
+          <w:b w:val="0"/>
+          <w:i w:val="0"/>
+          <w:sz w:val="21"/>
+        </w:rPr>
+        <w:t xml:space="preserve">This is the K1/K2 foundation from </w:t>
+      </w:r>
+      <w:r>
+        <w:rPr>
+          <w:rFonts w:ascii="Courier New" w:hAnsi="Courier New"/>
+          <w:color w:val="C0392B"/>
+          <w:sz w:val="18"/>
+        </w:rPr>
+        <w:t>Kinematic_Transition_v6_Implementation_Plan.md</w:t>
+      </w:r>
+      <w:r>
+        <w:rPr>
+          <w:b w:val="0"/>
+          <w:i w:val="0"/>
+          <w:sz w:val="21"/>
+        </w:rPr>
+        <w:t>; per-cluster kinematic</w:t>
+      </w:r>
+    </w:p>
+    <w:p>
+      <w:pPr>
+        <w:spacing w:after="120"/>
+      </w:pPr>
+      <w:r>
+        <w:rPr>
+          <w:b w:val="0"/>
+          <w:i w:val="0"/>
+        </w:rPr>
+        <w:t>signatures (</w:t>
+      </w:r>
+      <w:r>
+        <w:rPr>
+          <w:rFonts w:ascii="Courier New" w:hAnsi="Courier New"/>
+          <w:color w:val="C0392B"/>
+          <w:sz w:val="18"/>
+        </w:rPr>
+        <w:t>cluster_kinematics.csv</w:t>
+      </w:r>
+      <w:r>
+        <w:rPr>
+          <w:b w:val="0"/>
+          <w:i w:val="0"/>
+        </w:rPr>
+        <w:t>, see Output Files above) are unconditionally joined into the Analyser's per-cluster metrics table (Top-N Bar / Volcano / Heatmap "Metric:" selector) with no flag required, since that only reads a file that already exists once the pipeline has run.</w:t>
       </w:r>
     </w:p>
     <w:p>

</xml_diff>

<commit_message>
docs(v6-env-context): README/CLAUDE.md updates + docx regen for environmental context feature (CUBE_GUIDE.md also updated locally but is gitignored per repo convention, same as prior v6-kinematics prompt)
</commit_message>
<xml_diff>
--- a/CUBE_Complete_Guide.docx
+++ b/CUBE_Complete_Guide.docx
@@ -6813,13 +6813,25 @@
         <w:br/>
         <w:t xml:space="preserve">    &lt;stem&gt;_bout_lengths_hmm.csv      ← HMM-smoothed bouts (used by analyser by default)</w:t>
         <w:br/>
-        <w:t xml:space="preserve">    &lt;stem&gt;_bout_lengths_hmm_enriched.csv  ← (if kinematic_directedness_enabled, off by default)</w:t>
+        <w:t xml:space="preserve">    &lt;stem&gt;_bout_lengths_hmm_enriched.csv  ← (if kinematic_directedness_enabled and/or</w:t>
         <w:br/>
-        <w:t xml:space="preserve">                                             canonical 3 columns + net_displacement_px,</w:t>
+        <w:t xml:space="preserve">                                             env_features_enabled, both off by default) SHARED</w:t>
+        <w:br/>
+        <w:t xml:space="preserve">                                             sidecar: canonical 3 columns + net_displacement_px,</w:t>
         <w:br/>
         <w:t xml:space="preserve">                                             path_length_px, straightness_ratio,</w:t>
         <w:br/>
-        <w:t xml:space="preserve">                                             mean_speed_px_s, heading_consistency</w:t>
+        <w:t xml:space="preserve">                                             mean_speed_px_s, heading_consistency (kinematics)</w:t>
+        <w:br/>
+        <w:t xml:space="preserve">                                             and/or pct_time_in_region_&lt;name&gt;,</w:t>
+        <w:br/>
+        <w:t xml:space="preserve">                                             pct_time_near_object_&lt;name&gt;,</w:t>
+        <w:br/>
+        <w:t xml:space="preserve">                                             mean_heading_angle_to_object_&lt;name&gt; (env context)</w:t>
+        <w:br/>
+        <w:t xml:space="preserve">    &lt;stem&gt;_approach_events.csv       ← (if BOTH kinematic_directedness_enabled and</w:t>
+        <w:br/>
+        <w:t xml:space="preserve">                                         env_features_enabled with traced shapes)</w:t>
         <w:br/>
         <w:t xml:space="preserve">    &lt;stem&gt;_frame_labels.csv          ← per-frame: frame, time_s, label</w:t>
         <w:br/>
@@ -6836,6 +6848,12 @@
         <w:t xml:space="preserve">    umap_embedding.npy               ← (n_total_bins, n_components)</w:t>
         <w:br/>
         <w:t xml:space="preserve">    session_bin_ranges.json          ← {stem: [start, end, video_path]}</w:t>
+        <w:br/>
+        <w:t xml:space="preserve">    session_env_context.json         ← (if env_features_enabled, off by default) per-session</w:t>
+        <w:br/>
+        <w:t xml:space="preserve">                                         region/object time series, summaries, and paradigm-</w:t>
+        <w:br/>
+        <w:t xml:space="preserve">                                         gated derived metrics</w:t>
         <w:br/>
         <w:t xml:space="preserve">    hmm_model.pkl                    ← HMM parameters</w:t>
         <w:br/>
@@ -14550,6 +14568,692 @@
           <w:i w:val="0"/>
         </w:rPr>
         <w:t>, see Output Files above) are unconditionally joined into the Analyser's per-cluster metrics table (Top-N Bar / Volcano / Heatmap "Metric:" selector) with no flag required, since that only reads a file that already exists once the pipeline has run.</w:t>
+      </w:r>
+    </w:p>
+    <w:p>
+      <w:pPr>
+        <w:pStyle w:val="Heading3"/>
+        <w:spacing w:before="160" w:after="80"/>
+      </w:pPr>
+      <w:r>
+        <w:rPr>
+          <w:b/>
+          <w:color w:val="1F497D"/>
+          <w:sz w:val="24"/>
+        </w:rPr>
+        <w:t>Environmental Context &amp; Object Interaction (opt-in, v6 part 2)</w:t>
+      </w:r>
+    </w:p>
+    <w:p>
+      <w:pPr>
+        <w:pStyle w:val="ListBullet"/>
+      </w:pPr>
+      <w:r>
+        <w:rPr>
+          <w:rFonts w:ascii="Courier New" w:hAnsi="Courier New"/>
+          <w:color w:val="C0392B"/>
+          <w:sz w:val="18"/>
+        </w:rPr>
+        <w:t>env_features_enabled</w:t>
+      </w:r>
+      <w:r>
+        <w:rPr>
+          <w:b w:val="0"/>
+          <w:i w:val="0"/>
+          <w:sz w:val="21"/>
+        </w:rPr>
+        <w:t xml:space="preserve"> — </w:t>
+      </w:r>
+      <w:r>
+        <w:rPr>
+          <w:rFonts w:ascii="Courier New" w:hAnsi="Courier New"/>
+          <w:color w:val="C0392B"/>
+          <w:sz w:val="18"/>
+        </w:rPr>
+        <w:t>False</w:t>
+      </w:r>
+      <w:r>
+        <w:rPr>
+          <w:b w:val="0"/>
+          <w:i w:val="0"/>
+          <w:sz w:val="21"/>
+        </w:rPr>
+        <w:t xml:space="preserve"> (default, opt-in only, never auto-enabled, same "changes visible output</w:t>
+      </w:r>
+    </w:p>
+    <w:p>
+      <w:pPr>
+        <w:spacing w:after="120"/>
+      </w:pPr>
+      <w:r>
+        <w:rPr>
+          <w:b w:val="0"/>
+          <w:i w:val="0"/>
+        </w:rPr>
+        <w:t xml:space="preserve">schema so it never flips itself on" reasoning as </w:t>
+      </w:r>
+      <w:r>
+        <w:rPr>
+          <w:rFonts w:ascii="Courier New" w:hAnsi="Courier New"/>
+          <w:color w:val="C0392B"/>
+          <w:sz w:val="18"/>
+        </w:rPr>
+        <w:t>kinematic_directedness_enabled</w:t>
+      </w:r>
+      <w:r>
+        <w:rPr>
+          <w:b w:val="0"/>
+          <w:i w:val="0"/>
+        </w:rPr>
+        <w:t xml:space="preserve"> above). Set </w:t>
+      </w:r>
+      <w:r>
+        <w:rPr>
+          <w:rFonts w:ascii="Courier New" w:hAnsi="Courier New"/>
+          <w:color w:val="C0392B"/>
+          <w:sz w:val="18"/>
+        </w:rPr>
+        <w:t>True</w:t>
+      </w:r>
+      <w:r>
+        <w:rPr>
+          <w:b w:val="0"/>
+          <w:i w:val="0"/>
+        </w:rPr>
+        <w:t xml:space="preserve"> in Advanced Settings to reveal the </w:t>
+      </w:r>
+      <w:r>
+        <w:rPr>
+          <w:b/>
+          <w:i w:val="0"/>
+        </w:rPr>
+        <w:t>Environmental Context...</w:t>
+      </w:r>
+      <w:r>
+        <w:rPr>
+          <w:b w:val="0"/>
+          <w:i w:val="0"/>
+        </w:rPr>
+        <w:t xml:space="preserve"> button (disabled/greyed-out while the checkbox is off), which opens </w:t>
+      </w:r>
+      <w:r>
+        <w:rPr>
+          <w:rFonts w:ascii="Courier New" w:hAnsi="Courier New"/>
+          <w:color w:val="C0392B"/>
+          <w:sz w:val="18"/>
+        </w:rPr>
+        <w:t>EnvContextWindow</w:t>
+      </w:r>
+      <w:r>
+        <w:rPr>
+          <w:b w:val="0"/>
+          <w:i w:val="0"/>
+        </w:rPr>
+        <w:t>.</w:t>
+      </w:r>
+    </w:p>
+    <w:p>
+      <w:pPr>
+        <w:pStyle w:val="ListBullet"/>
+      </w:pPr>
+      <w:r>
+        <w:rPr>
+          <w:b/>
+          <w:i w:val="0"/>
+          <w:sz w:val="21"/>
+        </w:rPr>
+        <w:t>`EnvContextWindow`</w:t>
+      </w:r>
+      <w:r>
+        <w:rPr>
+          <w:b w:val="0"/>
+          <w:i w:val="0"/>
+          <w:sz w:val="21"/>
+        </w:rPr>
+        <w:t xml:space="preserve"> leads with a mandatory, project-wide paradigm choice — Open Field, Novel Object /</w:t>
+      </w:r>
+    </w:p>
+    <w:p>
+      <w:pPr>
+        <w:spacing w:after="120"/>
+      </w:pPr>
+      <w:r>
+        <w:rPr>
+          <w:b w:val="0"/>
+          <w:i w:val="0"/>
+        </w:rPr>
+        <w:t>Animal Recognition, Y-Maze, Elevated Plus Maze, Three-Chamber Test, Place Preference / CPP, or Custom — that determines which drawing tools, naming suggestions, and role dropdowns are shown. Only one paradigm is configured per project; a batch that genuinely mixes experiment types needs separate CUBE projects.</w:t>
+      </w:r>
+    </w:p>
+    <w:p>
+      <w:pPr>
+        <w:pStyle w:val="ListBullet2"/>
+      </w:pPr>
+      <w:r>
+        <w:rPr>
+          <w:b/>
+          <w:i w:val="0"/>
+          <w:sz w:val="21"/>
+        </w:rPr>
+        <w:t>Tab 1 "Define Reference Arena"</w:t>
+      </w:r>
+      <w:r>
+        <w:rPr>
+          <w:b w:val="0"/>
+          <w:i w:val="0"/>
+          <w:sz w:val="21"/>
+        </w:rPr>
+        <w:t>: trace an arena boundary and any number of named regions/objects on a</w:t>
+      </w:r>
+    </w:p>
+    <w:p>
+      <w:pPr>
+        <w:spacing w:after="120"/>
+      </w:pPr>
+      <w:r>
+        <w:rPr>
+          <w:b w:val="0"/>
+          <w:i w:val="0"/>
+        </w:rPr>
+        <w:t xml:space="preserve">reference video frame (click points, then </w:t>
+      </w:r>
+      <w:r>
+        <w:rPr>
+          <w:b/>
+          <w:i w:val="0"/>
+        </w:rPr>
+        <w:t>Finish Shape</w:t>
+      </w:r>
+      <w:r>
+        <w:rPr>
+          <w:b w:val="0"/>
+          <w:i w:val="0"/>
+        </w:rPr>
+        <w:t xml:space="preserve">; needs &gt;= 3 points, or 2 for a boundary). Each paradigm shows its typically-needed tool(s) expanded by default, with the other tucked under a collapsed </w:t>
+      </w:r>
+      <w:r>
+        <w:rPr>
+          <w:b/>
+          <w:i w:val="0"/>
+        </w:rPr>
+        <w:t>Advanced</w:t>
+      </w:r>
+      <w:r>
+        <w:rPr>
+          <w:b w:val="0"/>
+          <w:i w:val="0"/>
+        </w:rPr>
+        <w:t xml:space="preserve"> toggle — never fully hidden, since real experiments sometimes deviate from the textbook setup. Regions/objects relevant to the chosen paradigm's derived metrics get a </w:t>
+      </w:r>
+      <w:r>
+        <w:rPr>
+          <w:b/>
+          <w:i w:val="0"/>
+        </w:rPr>
+        <w:t>Role</w:t>
+      </w:r>
+      <w:r>
+        <w:rPr>
+          <w:b w:val="0"/>
+          <w:i w:val="0"/>
+        </w:rPr>
+        <w:t xml:space="preserve"> dropdown (e.g. Novel Object's objects: Familiar / Novel; Y-Maze's regions: Arm / Hub) — the metric keys off this explicit role, not the shape's display name, so you can name shapes however you like. A non-blocking warning explains when a paradigm's specialized metric can't compute yet for lack of enough role-tagged shapes (e.g. Y-Maze needs &gt;= 3 regions tagged Arm). </w:t>
+      </w:r>
+      <w:r>
+        <w:rPr>
+          <w:b/>
+          <w:i w:val="0"/>
+        </w:rPr>
+        <w:t>Save as Template...</w:t>
+      </w:r>
+      <w:r>
+        <w:rPr>
+          <w:b w:val="0"/>
+          <w:i w:val="0"/>
+        </w:rPr>
+        <w:t xml:space="preserve"> / </w:t>
+      </w:r>
+      <w:r>
+        <w:rPr>
+          <w:b/>
+          <w:i w:val="0"/>
+        </w:rPr>
+        <w:t>Load Template...</w:t>
+      </w:r>
+      <w:r>
+        <w:rPr>
+          <w:b w:val="0"/>
+          <w:i w:val="0"/>
+        </w:rPr>
+        <w:t xml:space="preserve"> persist the paradigm + traced shapes to a JSON file for reuse across projects.</w:t>
+      </w:r>
+    </w:p>
+    <w:p>
+      <w:pPr>
+        <w:pStyle w:val="ListBullet2"/>
+      </w:pPr>
+      <w:r>
+        <w:rPr>
+          <w:b/>
+          <w:i w:val="0"/>
+          <w:sz w:val="21"/>
+        </w:rPr>
+        <w:t>Tab 2 "Apply to Other Videos"</w:t>
+      </w:r>
+      <w:r>
+        <w:rPr>
+          <w:b w:val="0"/>
+          <w:i w:val="0"/>
+          <w:sz w:val="21"/>
+        </w:rPr>
+        <w:t>: every other paired video gets the reference shapes overlaid by default</w:t>
+      </w:r>
+    </w:p>
+    <w:p>
+      <w:pPr>
+        <w:spacing w:after="120"/>
+      </w:pPr>
+      <w:r>
+        <w:rPr>
+          <w:b w:val="0"/>
+          <w:i w:val="0"/>
+        </w:rPr>
+        <w:t xml:space="preserve">(no action required if that already looks correct — nothing is forced). Drag anywhere on the frame to nudge the whole shape set together (a single translate offset, covering the common case of a slightly shifted camera). The </w:t>
+      </w:r>
+      <w:r>
+        <w:rPr>
+          <w:b/>
+          <w:i w:val="0"/>
+        </w:rPr>
+        <w:t>Edit individual shapes</w:t>
+      </w:r>
+      <w:r>
+        <w:rPr>
+          <w:b w:val="0"/>
+          <w:i w:val="0"/>
+        </w:rPr>
+        <w:t xml:space="preserve"> toggle switches that video into an independent override where each shape can be dragged on its own — the escape hatch for when a simple shared nudge isn't enough (the arena itself changed, or the camera was also rotated/re-zoomed). </w:t>
+      </w:r>
+      <w:r>
+        <w:rPr>
+          <w:b/>
+          <w:i w:val="0"/>
+        </w:rPr>
+        <w:t>Reset to Reference</w:t>
+      </w:r>
+      <w:r>
+        <w:rPr>
+          <w:b w:val="0"/>
+          <w:i w:val="0"/>
+        </w:rPr>
+        <w:t xml:space="preserve"> clears a video back to the identity default.</w:t>
+      </w:r>
+    </w:p>
+    <w:p>
+      <w:pPr>
+        <w:pStyle w:val="ListBullet2"/>
+      </w:pPr>
+      <w:r>
+        <w:rPr>
+          <w:b/>
+          <w:i w:val="0"/>
+          <w:sz w:val="21"/>
+        </w:rPr>
+        <w:t>Coordinate-space correctness</w:t>
+      </w:r>
+      <w:r>
+        <w:rPr>
+          <w:b w:val="0"/>
+          <w:i w:val="0"/>
+          <w:sz w:val="21"/>
+        </w:rPr>
+        <w:t xml:space="preserve"> is handled structurally, not by a runtime check: </w:t>
+      </w:r>
+      <w:r>
+        <w:rPr>
+          <w:rFonts w:ascii="Courier New" w:hAnsi="Courier New"/>
+          <w:color w:val="C0392B"/>
+          <w:sz w:val="18"/>
+        </w:rPr>
+        <w:t>EnvContextWindow</w:t>
+      </w:r>
+    </w:p>
+    <w:p>
+      <w:pPr>
+        <w:spacing w:after="120"/>
+      </w:pPr>
+      <w:r>
+        <w:rPr>
+          <w:b w:val="0"/>
+          <w:i w:val="0"/>
+        </w:rPr>
+        <w:t>always reads video frames through the same crop rectangle (Advanced Settings → DLC crop region, if one is configured) that DLC itself tracked on, so traced shape vertices land in the same pixel coordinate space as the pose data by construction.</w:t>
+      </w:r>
+    </w:p>
+    <w:p>
+      <w:pPr>
+        <w:pStyle w:val="ListBullet"/>
+      </w:pPr>
+      <w:r>
+        <w:rPr>
+          <w:b/>
+          <w:i w:val="0"/>
+          <w:sz w:val="21"/>
+        </w:rPr>
+        <w:t>`env_interaction_threshold`</w:t>
+      </w:r>
+      <w:r>
+        <w:rPr>
+          <w:b w:val="0"/>
+          <w:i w:val="0"/>
+          <w:sz w:val="21"/>
+        </w:rPr>
+        <w:t xml:space="preserve"> — blank/unset (default) auto-derives a physically meaningful "one body</w:t>
+      </w:r>
+    </w:p>
+    <w:p>
+      <w:pPr>
+        <w:spacing w:after="120"/>
+      </w:pPr>
+      <w:r>
+        <w:rPr>
+          <w:b w:val="0"/>
+          <w:i w:val="0"/>
+        </w:rPr>
+        <w:t>length" pixel distance per session from that session's own tracked spine length, used as the object-contact threshold for interaction-bout detection. Enter a specific pixel value in Advanced Settings to override.</w:t>
+      </w:r>
+    </w:p>
+    <w:p>
+      <w:pPr>
+        <w:pStyle w:val="ListBullet"/>
+      </w:pPr>
+      <w:r>
+        <w:rPr>
+          <w:b w:val="0"/>
+          <w:i w:val="0"/>
+          <w:sz w:val="21"/>
+        </w:rPr>
+        <w:t xml:space="preserve">With the flag off, or on but nothing traced yet, this is a true no-op: no </w:t>
+      </w:r>
+      <w:r>
+        <w:rPr>
+          <w:rFonts w:ascii="Courier New" w:hAnsi="Courier New"/>
+          <w:color w:val="C0392B"/>
+          <w:sz w:val="18"/>
+        </w:rPr>
+        <w:t>session_env_context.json</w:t>
+      </w:r>
+      <w:r>
+        <w:rPr>
+          <w:b w:val="0"/>
+          <w:i w:val="0"/>
+          <w:sz w:val="21"/>
+        </w:rPr>
+        <w:t>, no</w:t>
+      </w:r>
+    </w:p>
+    <w:p>
+      <w:pPr>
+        <w:spacing w:after="120"/>
+      </w:pPr>
+      <w:r>
+        <w:rPr>
+          <w:b w:val="0"/>
+          <w:i w:val="0"/>
+        </w:rPr>
+        <w:t>bout-CSV columns — verified byte-identical output in both cases.</w:t>
+      </w:r>
+    </w:p>
+    <w:p>
+      <w:pPr>
+        <w:pStyle w:val="ListBullet"/>
+      </w:pPr>
+      <w:r>
+        <w:rPr>
+          <w:b/>
+          <w:i w:val="0"/>
+          <w:sz w:val="21"/>
+        </w:rPr>
+        <w:t>Output</w:t>
+      </w:r>
+      <w:r>
+        <w:rPr>
+          <w:b w:val="0"/>
+          <w:i w:val="0"/>
+          <w:sz w:val="21"/>
+        </w:rPr>
+        <w:t xml:space="preserve">: </w:t>
+      </w:r>
+      <w:r>
+        <w:rPr>
+          <w:rFonts w:ascii="Courier New" w:hAnsi="Courier New"/>
+          <w:color w:val="C0392B"/>
+          <w:sz w:val="18"/>
+        </w:rPr>
+        <w:t>model/session_env_context.json</w:t>
+      </w:r>
+      <w:r>
+        <w:rPr>
+          <w:b w:val="0"/>
+          <w:i w:val="0"/>
+          <w:sz w:val="21"/>
+        </w:rPr>
+        <w:t xml:space="preserve"> (per-session per-bin region/object time series + summaries +</w:t>
+      </w:r>
+    </w:p>
+    <w:p>
+      <w:pPr>
+        <w:spacing w:after="120"/>
+      </w:pPr>
+      <w:r>
+        <w:rPr>
+          <w:b w:val="0"/>
+          <w:i w:val="0"/>
+        </w:rPr>
+        <w:t>paradigm-gated derived metrics — spontaneous alternation % for Y-Maze, open-arm time/entries/latency for Elevated Plus Maze, discrimination index for Novel Object, sociability/social-novelty indices for Three-Chamber, preference index for Place Preference/CPP). Region/object columns (</w:t>
+      </w:r>
+      <w:r>
+        <w:rPr>
+          <w:rFonts w:ascii="Courier New" w:hAnsi="Courier New"/>
+          <w:color w:val="C0392B"/>
+          <w:sz w:val="18"/>
+        </w:rPr>
+        <w:t>pct_time_in_region_&lt;name&gt;</w:t>
+      </w:r>
+      <w:r>
+        <w:rPr>
+          <w:b w:val="0"/>
+          <w:i w:val="0"/>
+        </w:rPr>
+        <w:t xml:space="preserve">, </w:t>
+      </w:r>
+      <w:r>
+        <w:rPr>
+          <w:rFonts w:ascii="Courier New" w:hAnsi="Courier New"/>
+          <w:color w:val="C0392B"/>
+          <w:sz w:val="18"/>
+        </w:rPr>
+        <w:t>pct_time_near_object_&lt;name&gt;</w:t>
+      </w:r>
+      <w:r>
+        <w:rPr>
+          <w:b w:val="0"/>
+          <w:i w:val="0"/>
+        </w:rPr>
+        <w:t xml:space="preserve">, </w:t>
+      </w:r>
+      <w:r>
+        <w:rPr>
+          <w:rFonts w:ascii="Courier New" w:hAnsi="Courier New"/>
+          <w:color w:val="C0392B"/>
+          <w:sz w:val="18"/>
+        </w:rPr>
+        <w:t>mean_heading_angle_to_object_&lt;name&gt;</w:t>
+      </w:r>
+      <w:r>
+        <w:rPr>
+          <w:b w:val="0"/>
+          <w:i w:val="0"/>
+        </w:rPr>
+        <w:t xml:space="preserve">) are appended to the same </w:t>
+      </w:r>
+      <w:r>
+        <w:rPr>
+          <w:rFonts w:ascii="Courier New" w:hAnsi="Courier New"/>
+          <w:color w:val="C0392B"/>
+          <w:sz w:val="18"/>
+        </w:rPr>
+        <w:t>*_bout_lengths_hmm_enriched.csv</w:t>
+      </w:r>
+      <w:r>
+        <w:rPr>
+          <w:b w:val="0"/>
+          <w:i w:val="0"/>
+        </w:rPr>
+        <w:t xml:space="preserve"> sidecar </w:t>
+      </w:r>
+      <w:r>
+        <w:rPr>
+          <w:rFonts w:ascii="Courier New" w:hAnsi="Courier New"/>
+          <w:color w:val="C0392B"/>
+          <w:sz w:val="18"/>
+        </w:rPr>
+        <w:t>kinematic_directedness_enabled</w:t>
+      </w:r>
+      <w:r>
+        <w:rPr>
+          <w:b w:val="0"/>
+          <w:i w:val="0"/>
+        </w:rPr>
+        <w:t xml:space="preserve"> uses — if both flags are on, one sidecar carries both plans' columns.</w:t>
+      </w:r>
+    </w:p>
+    <w:p>
+      <w:pPr>
+        <w:pStyle w:val="ListBullet"/>
+      </w:pPr>
+      <w:r>
+        <w:rPr>
+          <w:b w:val="0"/>
+          <w:i w:val="0"/>
+          <w:sz w:val="21"/>
+        </w:rPr>
+        <w:t xml:space="preserve">With BOTH </w:t>
+      </w:r>
+      <w:r>
+        <w:rPr>
+          <w:rFonts w:ascii="Courier New" w:hAnsi="Courier New"/>
+          <w:color w:val="C0392B"/>
+          <w:sz w:val="18"/>
+        </w:rPr>
+        <w:t>env_features_enabled</w:t>
+      </w:r>
+      <w:r>
+        <w:rPr>
+          <w:b w:val="0"/>
+          <w:i w:val="0"/>
+          <w:sz w:val="21"/>
+        </w:rPr>
+        <w:t xml:space="preserve"> and </w:t>
+      </w:r>
+      <w:r>
+        <w:rPr>
+          <w:rFonts w:ascii="Courier New" w:hAnsi="Courier New"/>
+          <w:color w:val="C0392B"/>
+          <w:sz w:val="18"/>
+        </w:rPr>
+        <w:t>kinematic_directedness_enabled</w:t>
+      </w:r>
+      <w:r>
+        <w:rPr>
+          <w:b w:val="0"/>
+          <w:i w:val="0"/>
+          <w:sz w:val="21"/>
+        </w:rPr>
+        <w:t xml:space="preserve"> on, a rule-based approach/avoid</w:t>
+      </w:r>
+    </w:p>
+    <w:p>
+      <w:pPr>
+        <w:spacing w:after="120"/>
+      </w:pPr>
+      <w:r>
+        <w:rPr>
+          <w:b w:val="0"/>
+          <w:i w:val="0"/>
+        </w:rPr>
+        <w:t xml:space="preserve">detector additionally writes </w:t>
+      </w:r>
+      <w:r>
+        <w:rPr>
+          <w:rFonts w:ascii="Courier New" w:hAnsi="Courier New"/>
+          <w:color w:val="C0392B"/>
+          <w:sz w:val="18"/>
+        </w:rPr>
+        <w:t>&lt;stem&gt;_approach_events.csv</w:t>
+      </w:r>
+      <w:r>
+        <w:rPr>
+          <w:b w:val="0"/>
+          <w:i w:val="0"/>
+        </w:rPr>
+        <w:t xml:space="preserve"> (only when at least one event is found): a fast, straight-line bout immediately followed by a slower investigation-type bout is flagged as an "approach," tagged with the region/object it was heading toward.</w:t>
+      </w:r>
+    </w:p>
+    <w:p>
+      <w:pPr>
+        <w:pStyle w:val="ListBullet"/>
+      </w:pPr>
+      <w:r>
+        <w:rPr>
+          <w:b w:val="0"/>
+          <w:i w:val="0"/>
+          <w:sz w:val="21"/>
+        </w:rPr>
+        <w:t xml:space="preserve">This is the v6 part 2 foundation from </w:t>
+      </w:r>
+      <w:r>
+        <w:rPr>
+          <w:rFonts w:ascii="Courier New" w:hAnsi="Courier New"/>
+          <w:color w:val="C0392B"/>
+          <w:sz w:val="18"/>
+        </w:rPr>
+        <w:t>Environmental_Context_v6_Implementation_Plan.md</w:t>
+      </w:r>
+      <w:r>
+        <w:rPr>
+          <w:b w:val="0"/>
+          <w:i w:val="0"/>
+          <w:sz w:val="21"/>
+        </w:rPr>
+        <w:t>; the corresponding</w:t>
+      </w:r>
+    </w:p>
+    <w:p>
+      <w:pPr>
+        <w:spacing w:after="120"/>
+      </w:pPr>
+      <w:r>
+        <w:rPr>
+          <w:b w:val="0"/>
+          <w:i w:val="0"/>
+        </w:rPr>
+        <w:t xml:space="preserve">Analyser-side "Paradigm Results" reporting tab is tracked separately in </w:t>
+      </w:r>
+      <w:r>
+        <w:rPr>
+          <w:rFonts w:ascii="Courier New" w:hAnsi="Courier New"/>
+          <w:color w:val="C0392B"/>
+          <w:sz w:val="18"/>
+        </w:rPr>
+        <w:t>CUBE_Analyser_Paradigm_Reporting_Plan.md</w:t>
+      </w:r>
+      <w:r>
+        <w:rPr>
+          <w:b w:val="0"/>
+          <w:i w:val="0"/>
+        </w:rPr>
+        <w:t>.</w:t>
       </w:r>
     </w:p>
     <w:p>

</xml_diff>

<commit_message>
docs(v6-env-context): update approach/avoid schema docs + report addendum for bugfix pass
</commit_message>
<xml_diff>
--- a/CUBE_Complete_Guide.docx
+++ b/CUBE_Complete_Guide.docx
@@ -15197,7 +15197,67 @@
           <w:b w:val="0"/>
           <w:i w:val="0"/>
         </w:rPr>
-        <w:t xml:space="preserve"> (only when at least one event is found): a fast, straight-line bout immediately followed by a slower investigation-type bout is flagged as an "approach," tagged with the region/object it was heading toward.</w:t>
+        <w:t xml:space="preserve"> (only when at least one event is found), with a </w:t>
+      </w:r>
+      <w:r>
+        <w:rPr>
+          <w:rFonts w:ascii="Courier New" w:hAnsi="Courier New"/>
+          <w:color w:val="C0392B"/>
+          <w:sz w:val="18"/>
+        </w:rPr>
+        <w:t>classification</w:t>
+      </w:r>
+      <w:r>
+        <w:rPr>
+          <w:b w:val="0"/>
+          <w:i w:val="0"/>
+        </w:rPr>
+        <w:t xml:space="preserve"> column of </w:t>
+      </w:r>
+      <w:r>
+        <w:rPr>
+          <w:rFonts w:ascii="Courier New" w:hAnsi="Courier New"/>
+          <w:color w:val="C0392B"/>
+          <w:sz w:val="18"/>
+        </w:rPr>
+        <w:t>"approach"</w:t>
+      </w:r>
+      <w:r>
+        <w:rPr>
+          <w:b w:val="0"/>
+          <w:i w:val="0"/>
+        </w:rPr>
+        <w:t xml:space="preserve"> or </w:t>
+      </w:r>
+      <w:r>
+        <w:rPr>
+          <w:rFonts w:ascii="Courier New" w:hAnsi="Courier New"/>
+          <w:color w:val="C0392B"/>
+          <w:sz w:val="18"/>
+        </w:rPr>
+        <w:t>"avoid"</w:t>
+      </w:r>
+      <w:r>
+        <w:rPr>
+          <w:b w:val="0"/>
+          <w:i w:val="0"/>
+        </w:rPr>
+        <w:t xml:space="preserve"> (a bout can produce either, both, or neither): a fast, straight-line bout immediately followed by a slower investigation-type bout, ending within </w:t>
+      </w:r>
+      <w:r>
+        <w:rPr>
+          <w:rFonts w:ascii="Courier New" w:hAnsi="Courier New"/>
+          <w:color w:val="C0392B"/>
+          <w:sz w:val="18"/>
+        </w:rPr>
+        <w:t>env_interaction_threshold</w:t>
+      </w:r>
+      <w:r>
+        <w:rPr>
+          <w:b w:val="0"/>
+          <w:i w:val="0"/>
+        </w:rPr>
+        <w:t xml:space="preserve"> of a traced region/object, is flagged "approach" and tagged with that region/object; a fast, straight-line bout that started near a traced object/region and ended meaningfully farther away (or left the region) is flagged "avoid," with no following-bout requirement.</w:t>
       </w:r>
     </w:p>
     <w:p>

</xml_diff>

<commit_message>
docs(v6-analyser-reporting): README/CUBE_GUIDE Paradigm Results tab sections + docx regen
</commit_message>
<xml_diff>
--- a/CUBE_Complete_Guide.docx
+++ b/CUBE_Complete_Guide.docx
@@ -271,6 +271,19 @@
           <w:u w:val="single"/>
         </w:rPr>
         <w:t>Group Predictor Tab</w:t>
+      </w:r>
+    </w:p>
+    <w:p>
+      <w:pPr>
+        <w:pStyle w:val="ListBullet2"/>
+      </w:pPr>
+      <w:r>
+        <w:rPr>
+          <w:color w:val="005699"/>
+          <w:sz w:val="21"/>
+          <w:u w:val="single"/>
+        </w:rPr>
+        <w:t>Paradigm Results Tab</w:t>
       </w:r>
     </w:p>
     <w:p>
@@ -10749,6 +10762,904 @@
           <w:sz w:val="21"/>
         </w:rPr>
         <w:t xml:space="preserve"> on the best model.</w:t>
+      </w:r>
+    </w:p>
+    <w:p>
+      <w:pPr>
+        <w:spacing w:before="80" w:after="80"/>
+        <w:pBdr>
+          <w:bottom w:val="single" w:sz="6" w:space="1" w:color="CCCCCC"/>
+        </w:pBdr>
+      </w:pPr>
+    </w:p>
+    <w:p>
+      <w:pPr>
+        <w:pStyle w:val="Heading3"/>
+        <w:spacing w:before="160" w:after="80"/>
+      </w:pPr>
+      <w:r>
+        <w:rPr>
+          <w:b/>
+          <w:color w:val="1F497D"/>
+          <w:sz w:val="24"/>
+        </w:rPr>
+        <w:t>Paradigm Results Tab (v6 part 3)</w:t>
+      </w:r>
+    </w:p>
+    <w:p>
+      <w:pPr>
+        <w:spacing w:after="120"/>
+      </w:pPr>
+      <w:r>
+        <w:rPr>
+          <w:b/>
+          <w:i w:val="0"/>
+        </w:rPr>
+        <w:t>Behavioral-paradigm-specific reporting, built on top of the Environmental Context feature (v6 part 2).</w:t>
+      </w:r>
+    </w:p>
+    <w:p>
+      <w:pPr>
+        <w:spacing w:after="120"/>
+      </w:pPr>
+      <w:r>
+        <w:rPr>
+          <w:b w:val="0"/>
+          <w:i w:val="0"/>
+        </w:rPr>
+        <w:t xml:space="preserve">This tab only has content when at least one loaded session was run with </w:t>
+      </w:r>
+      <w:r>
+        <w:rPr>
+          <w:b/>
+          <w:i w:val="0"/>
+        </w:rPr>
+        <w:t>Environmental Context tracing enabled</w:t>
+      </w:r>
+      <w:r>
+        <w:rPr>
+          <w:b w:val="0"/>
+          <w:i w:val="0"/>
+        </w:rPr>
+        <w:t xml:space="preserve"> (</w:t>
+      </w:r>
+      <w:r>
+        <w:rPr>
+          <w:rFonts w:ascii="Courier New" w:hAnsi="Courier New"/>
+          <w:color w:val="C0392B"/>
+          <w:sz w:val="18"/>
+        </w:rPr>
+        <w:t>env_features_enabled</w:t>
+      </w:r>
+      <w:r>
+        <w:rPr>
+          <w:b w:val="0"/>
+          <w:i w:val="0"/>
+        </w:rPr>
+        <w:t xml:space="preserve">, see Advanced Settings) and has a real </w:t>
+      </w:r>
+      <w:r>
+        <w:rPr>
+          <w:rFonts w:ascii="Courier New" w:hAnsi="Courier New"/>
+          <w:color w:val="C0392B"/>
+          <w:sz w:val="18"/>
+        </w:rPr>
+        <w:t>session_env_context.json</w:t>
+      </w:r>
+      <w:r>
+        <w:rPr>
+          <w:b w:val="0"/>
+          <w:i w:val="0"/>
+        </w:rPr>
+        <w:t xml:space="preserve"> on disk — sessions predating v6, or run with the flag off, show a clear "no environmental context data" message instead of a plot, for every sub-view. The tab itself is always present in the tab bar (like every other tab); its content is what's gated on data availability.</w:t>
+      </w:r>
+    </w:p>
+    <w:p>
+      <w:pPr>
+        <w:spacing w:after="120"/>
+      </w:pPr>
+      <w:r>
+        <w:rPr>
+          <w:b/>
+          <w:i w:val="0"/>
+        </w:rPr>
+        <w:t>Quick start:</w:t>
+      </w:r>
+    </w:p>
+    <w:p>
+      <w:pPr>
+        <w:pStyle w:val="ListNumber"/>
+      </w:pPr>
+      <w:r>
+        <w:rPr>
+          <w:b w:val="0"/>
+          <w:i w:val="0"/>
+          <w:sz w:val="21"/>
+        </w:rPr>
+        <w:t>Load sessions in the Combined Analysis tab as usual (a mix of sessions with and without environmental context data is fine).</w:t>
+      </w:r>
+    </w:p>
+    <w:p>
+      <w:pPr>
+        <w:pStyle w:val="ListNumber"/>
+      </w:pPr>
+      <w:r>
+        <w:rPr>
+          <w:b w:val="0"/>
+          <w:i w:val="0"/>
+          <w:sz w:val="21"/>
+        </w:rPr>
+        <w:t xml:space="preserve">Switch to the Paradigm Results tab and click </w:t>
+      </w:r>
+      <w:r>
+        <w:rPr>
+          <w:b/>
+          <w:i w:val="0"/>
+          <w:sz w:val="21"/>
+        </w:rPr>
+        <w:t>Refresh from Loaded Sessions</w:t>
+      </w:r>
+      <w:r>
+        <w:rPr>
+          <w:b w:val="0"/>
+          <w:i w:val="0"/>
+          <w:sz w:val="21"/>
+        </w:rPr>
+        <w:t>.</w:t>
+      </w:r>
+    </w:p>
+    <w:p>
+      <w:pPr>
+        <w:pStyle w:val="ListNumber"/>
+      </w:pPr>
+      <w:r>
+        <w:rPr>
+          <w:b w:val="0"/>
+          <w:i w:val="0"/>
+          <w:sz w:val="21"/>
+        </w:rPr>
+        <w:t xml:space="preserve">The sub-view matching your traced paradigm auto-selects. Use the </w:t>
+      </w:r>
+      <w:r>
+        <w:rPr>
+          <w:b/>
+          <w:i w:val="0"/>
+          <w:sz w:val="21"/>
+        </w:rPr>
+        <w:t>Paradigm Sub-view</w:t>
+      </w:r>
+      <w:r>
+        <w:rPr>
+          <w:b w:val="0"/>
+          <w:i w:val="0"/>
+          <w:sz w:val="21"/>
+        </w:rPr>
+        <w:t xml:space="preserve"> dropdown to browse others — a sub-view that doesn't match any loaded session's paradigm shows a placeholder rather than wrong data.</w:t>
+      </w:r>
+    </w:p>
+    <w:p>
+      <w:pPr>
+        <w:spacing w:after="120"/>
+      </w:pPr>
+      <w:r>
+        <w:rPr>
+          <w:b/>
+          <w:i w:val="0"/>
+        </w:rPr>
+        <w:t>The seven sub-views:</w:t>
+      </w:r>
+    </w:p>
+    <w:tbl>
+      <w:tblPr>
+        <w:tblStyle w:val="TableGrid"/>
+        <w:tblW w:type="auto" w:w="0"/>
+        <w:tblLook w:firstColumn="1" w:firstRow="1" w:lastColumn="0" w:lastRow="0" w:noHBand="0" w:noVBand="1" w:val="04A0"/>
+      </w:tblPr>
+      <w:tblGrid>
+        <w:gridCol w:w="3120"/>
+        <w:gridCol w:w="3120"/>
+        <w:gridCol w:w="3120"/>
+      </w:tblGrid>
+      <w:tr>
+        <w:tc>
+          <w:tcPr>
+            <w:tcW w:type="dxa" w:w="3120"/>
+            <w:shd w:fill="2E74B5" w:val="clear"/>
+          </w:tcPr>
+          <w:p>
+            <w:pPr>
+              <w:spacing w:before="40" w:after="40"/>
+            </w:pPr>
+            <w:r>
+              <w:rPr>
+                <w:b/>
+                <w:i w:val="0"/>
+                <w:color w:val="FFFFFF"/>
+                <w:sz w:val="19"/>
+              </w:rPr>
+              <w:t>Sub-view</w:t>
+            </w:r>
+          </w:p>
+        </w:tc>
+        <w:tc>
+          <w:tcPr>
+            <w:tcW w:type="dxa" w:w="3120"/>
+            <w:shd w:fill="2E74B5" w:val="clear"/>
+          </w:tcPr>
+          <w:p>
+            <w:pPr>
+              <w:spacing w:before="40" w:after="40"/>
+            </w:pPr>
+            <w:r>
+              <w:rPr>
+                <w:b/>
+                <w:i w:val="0"/>
+                <w:color w:val="FFFFFF"/>
+                <w:sz w:val="19"/>
+              </w:rPr>
+              <w:t>Applies to paradigm</w:t>
+            </w:r>
+          </w:p>
+        </w:tc>
+        <w:tc>
+          <w:tcPr>
+            <w:tcW w:type="dxa" w:w="3120"/>
+            <w:shd w:fill="2E74B5" w:val="clear"/>
+          </w:tcPr>
+          <w:p>
+            <w:pPr>
+              <w:spacing w:before="40" w:after="40"/>
+            </w:pPr>
+            <w:r>
+              <w:rPr>
+                <w:b/>
+                <w:i w:val="0"/>
+                <w:color w:val="FFFFFF"/>
+                <w:sz w:val="19"/>
+              </w:rPr>
+              <w:t>What it shows</w:t>
+            </w:r>
+          </w:p>
+        </w:tc>
+      </w:tr>
+      <w:tr>
+        <w:tc>
+          <w:tcPr>
+            <w:tcW w:type="dxa" w:w="3120"/>
+          </w:tcPr>
+          <w:p>
+            <w:pPr>
+              <w:spacing w:before="40" w:after="40"/>
+            </w:pPr>
+            <w:r>
+              <w:rPr>
+                <w:b w:val="0"/>
+                <w:i w:val="0"/>
+                <w:sz w:val="19"/>
+              </w:rPr>
+              <w:t>Generic</w:t>
+            </w:r>
+          </w:p>
+        </w:tc>
+        <w:tc>
+          <w:tcPr>
+            <w:tcW w:type="dxa" w:w="3120"/>
+          </w:tcPr>
+          <w:p>
+            <w:pPr>
+              <w:spacing w:before="40" w:after="40"/>
+            </w:pPr>
+            <w:r>
+              <w:rPr>
+                <w:b w:val="0"/>
+                <w:i w:val="0"/>
+                <w:sz w:val="19"/>
+              </w:rPr>
+              <w:t xml:space="preserve">All paradigms (default for </w:t>
+            </w:r>
+            <w:r>
+              <w:rPr>
+                <w:rFonts w:ascii="Courier New" w:hAnsi="Courier New"/>
+                <w:color w:val="C0392B"/>
+                <w:sz w:val="18"/>
+              </w:rPr>
+              <w:t>custom</w:t>
+            </w:r>
+            <w:r>
+              <w:rPr>
+                <w:b w:val="0"/>
+                <w:i w:val="0"/>
+                <w:sz w:val="19"/>
+              </w:rPr>
+              <w:t>/Open Field)</w:t>
+            </w:r>
+          </w:p>
+        </w:tc>
+        <w:tc>
+          <w:tcPr>
+            <w:tcW w:type="dxa" w:w="3120"/>
+          </w:tcPr>
+          <w:p>
+            <w:pPr>
+              <w:spacing w:before="40" w:after="40"/>
+            </w:pPr>
+            <w:r>
+              <w:rPr>
+                <w:b w:val="0"/>
+                <w:i w:val="0"/>
+                <w:sz w:val="19"/>
+              </w:rPr>
+              <w:t>Whole-arena occupancy heatmap, region-time control bar; for Open Field specifically, also total distance traveled and center-zone entry frequency (looks for a traced region named containing "center")</w:t>
+            </w:r>
+          </w:p>
+        </w:tc>
+      </w:tr>
+      <w:tr>
+        <w:tc>
+          <w:tcPr>
+            <w:tcW w:type="dxa" w:w="3120"/>
+            <w:shd w:fill="EEF3FA" w:val="clear"/>
+          </w:tcPr>
+          <w:p>
+            <w:pPr>
+              <w:spacing w:before="40" w:after="40"/>
+            </w:pPr>
+            <w:r>
+              <w:rPr>
+                <w:b w:val="0"/>
+                <w:i w:val="0"/>
+                <w:sz w:val="19"/>
+              </w:rPr>
+              <w:t>Y-Maze Alternation</w:t>
+            </w:r>
+          </w:p>
+        </w:tc>
+        <w:tc>
+          <w:tcPr>
+            <w:tcW w:type="dxa" w:w="3120"/>
+            <w:shd w:fill="EEF3FA" w:val="clear"/>
+          </w:tcPr>
+          <w:p>
+            <w:pPr>
+              <w:spacing w:before="40" w:after="40"/>
+            </w:pPr>
+            <w:r>
+              <w:rPr>
+                <w:rFonts w:ascii="Courier New" w:hAnsi="Courier New"/>
+                <w:color w:val="C0392B"/>
+                <w:sz w:val="18"/>
+              </w:rPr>
+              <w:t>y_maze</w:t>
+            </w:r>
+          </w:p>
+        </w:tc>
+        <w:tc>
+          <w:tcPr>
+            <w:tcW w:type="dxa" w:w="3120"/>
+            <w:shd w:fill="EEF3FA" w:val="clear"/>
+          </w:tcPr>
+          <w:p>
+            <w:pPr>
+              <w:spacing w:before="40" w:after="40"/>
+            </w:pPr>
+            <w:r>
+              <w:rPr>
+                <w:b w:val="0"/>
+                <w:i w:val="0"/>
+                <w:sz w:val="19"/>
+              </w:rPr>
+              <w:t>Per-arm occupancy heatmap, spontaneous alternation %, total arm entries (activity control)</w:t>
+            </w:r>
+          </w:p>
+        </w:tc>
+      </w:tr>
+      <w:tr>
+        <w:tc>
+          <w:tcPr>
+            <w:tcW w:type="dxa" w:w="3120"/>
+          </w:tcPr>
+          <w:p>
+            <w:pPr>
+              <w:spacing w:before="40" w:after="40"/>
+            </w:pPr>
+            <w:r>
+              <w:rPr>
+                <w:b w:val="0"/>
+                <w:i w:val="0"/>
+                <w:sz w:val="19"/>
+              </w:rPr>
+              <w:t>Elevated Plus Maze</w:t>
+            </w:r>
+          </w:p>
+        </w:tc>
+        <w:tc>
+          <w:tcPr>
+            <w:tcW w:type="dxa" w:w="3120"/>
+          </w:tcPr>
+          <w:p>
+            <w:pPr>
+              <w:spacing w:before="40" w:after="40"/>
+            </w:pPr>
+            <w:r>
+              <w:rPr>
+                <w:rFonts w:ascii="Courier New" w:hAnsi="Courier New"/>
+                <w:color w:val="C0392B"/>
+                <w:sz w:val="18"/>
+              </w:rPr>
+              <w:t>elevated_plus_maze</w:t>
+            </w:r>
+          </w:p>
+        </w:tc>
+        <w:tc>
+          <w:tcPr>
+            <w:tcW w:type="dxa" w:w="3120"/>
+          </w:tcPr>
+          <w:p>
+            <w:pPr>
+              <w:spacing w:before="40" w:after="40"/>
+            </w:pPr>
+            <w:r>
+              <w:rPr>
+                <w:b w:val="0"/>
+                <w:i w:val="0"/>
+                <w:sz w:val="19"/>
+              </w:rPr>
+              <w:t>Open- vs. closed-arm occupancy heatmap, % open-arm time/entries, latency to first open-arm entry, total arm entries (locomotor control)</w:t>
+            </w:r>
+          </w:p>
+        </w:tc>
+      </w:tr>
+      <w:tr>
+        <w:tc>
+          <w:tcPr>
+            <w:tcW w:type="dxa" w:w="3120"/>
+            <w:shd w:fill="EEF3FA" w:val="clear"/>
+          </w:tcPr>
+          <w:p>
+            <w:pPr>
+              <w:spacing w:before="40" w:after="40"/>
+            </w:pPr>
+            <w:r>
+              <w:rPr>
+                <w:b w:val="0"/>
+                <w:i w:val="0"/>
+                <w:sz w:val="19"/>
+              </w:rPr>
+              <w:t>Discrimination Index</w:t>
+            </w:r>
+          </w:p>
+        </w:tc>
+        <w:tc>
+          <w:tcPr>
+            <w:tcW w:type="dxa" w:w="3120"/>
+            <w:shd w:fill="EEF3FA" w:val="clear"/>
+          </w:tcPr>
+          <w:p>
+            <w:pPr>
+              <w:spacing w:before="40" w:after="40"/>
+            </w:pPr>
+            <w:r>
+              <w:rPr>
+                <w:rFonts w:ascii="Courier New" w:hAnsi="Courier New"/>
+                <w:color w:val="C0392B"/>
+                <w:sz w:val="18"/>
+              </w:rPr>
+              <w:t>novel_object</w:t>
+            </w:r>
+          </w:p>
+        </w:tc>
+        <w:tc>
+          <w:tcPr>
+            <w:tcW w:type="dxa" w:w="3120"/>
+            <w:shd w:fill="EEF3FA" w:val="clear"/>
+          </w:tcPr>
+          <w:p>
+            <w:pPr>
+              <w:spacing w:before="40" w:after="40"/>
+            </w:pPr>
+            <w:r>
+              <w:rPr>
+                <w:b w:val="0"/>
+                <w:i w:val="0"/>
+                <w:sz w:val="19"/>
+              </w:rPr>
+              <w:t>Investigation-density heatmap around each object, discrimination index (tested against chance = 0), total exploration time (validity control)</w:t>
+            </w:r>
+          </w:p>
+        </w:tc>
+      </w:tr>
+      <w:tr>
+        <w:tc>
+          <w:tcPr>
+            <w:tcW w:type="dxa" w:w="3120"/>
+          </w:tcPr>
+          <w:p>
+            <w:pPr>
+              <w:spacing w:before="40" w:after="40"/>
+            </w:pPr>
+            <w:r>
+              <w:rPr>
+                <w:b w:val="0"/>
+                <w:i w:val="0"/>
+                <w:sz w:val="19"/>
+              </w:rPr>
+              <w:t>Sociability / Social Novelty</w:t>
+            </w:r>
+          </w:p>
+        </w:tc>
+        <w:tc>
+          <w:tcPr>
+            <w:tcW w:type="dxa" w:w="3120"/>
+          </w:tcPr>
+          <w:p>
+            <w:pPr>
+              <w:spacing w:before="40" w:after="40"/>
+            </w:pPr>
+            <w:r>
+              <w:rPr>
+                <w:rFonts w:ascii="Courier New" w:hAnsi="Courier New"/>
+                <w:color w:val="C0392B"/>
+                <w:sz w:val="18"/>
+              </w:rPr>
+              <w:t>three_chamber</w:t>
+            </w:r>
+          </w:p>
+        </w:tc>
+        <w:tc>
+          <w:tcPr>
+            <w:tcW w:type="dxa" w:w="3120"/>
+          </w:tcPr>
+          <w:p>
+            <w:pPr>
+              <w:spacing w:before="40" w:after="40"/>
+            </w:pPr>
+            <w:r>
+              <w:rPr>
+                <w:b w:val="0"/>
+                <w:i w:val="0"/>
+                <w:sz w:val="19"/>
+              </w:rPr>
+              <w:t>Per-chamber occupancy heatmap, Phase 1 sociability index and Phase 2 social-novelty index (each tested independently against 0), chamber entry frequency (activity control)</w:t>
+            </w:r>
+          </w:p>
+        </w:tc>
+      </w:tr>
+      <w:tr>
+        <w:tc>
+          <w:tcPr>
+            <w:tcW w:type="dxa" w:w="3120"/>
+            <w:shd w:fill="EEF3FA" w:val="clear"/>
+          </w:tcPr>
+          <w:p>
+            <w:pPr>
+              <w:spacing w:before="40" w:after="40"/>
+            </w:pPr>
+            <w:r>
+              <w:rPr>
+                <w:b w:val="0"/>
+                <w:i w:val="0"/>
+                <w:sz w:val="19"/>
+              </w:rPr>
+              <w:t>Place Preference / CPP</w:t>
+            </w:r>
+          </w:p>
+        </w:tc>
+        <w:tc>
+          <w:tcPr>
+            <w:tcW w:type="dxa" w:w="3120"/>
+            <w:shd w:fill="EEF3FA" w:val="clear"/>
+          </w:tcPr>
+          <w:p>
+            <w:pPr>
+              <w:spacing w:before="40" w:after="40"/>
+            </w:pPr>
+            <w:r>
+              <w:rPr>
+                <w:rFonts w:ascii="Courier New" w:hAnsi="Courier New"/>
+                <w:color w:val="C0392B"/>
+                <w:sz w:val="18"/>
+              </w:rPr>
+              <w:t>place_preference</w:t>
+            </w:r>
+          </w:p>
+        </w:tc>
+        <w:tc>
+          <w:tcPr>
+            <w:tcW w:type="dxa" w:w="3120"/>
+            <w:shd w:fill="EEF3FA" w:val="clear"/>
+          </w:tcPr>
+          <w:p>
+            <w:pPr>
+              <w:spacing w:before="40" w:after="40"/>
+            </w:pPr>
+            <w:r>
+              <w:rPr>
+                <w:b w:val="0"/>
+                <w:i w:val="0"/>
+                <w:sz w:val="19"/>
+              </w:rPr>
+              <w:t xml:space="preserve">Pre/post occupancy heatmap, preference index (tested against 0), and — when </w:t>
+            </w:r>
+            <w:r>
+              <w:rPr>
+                <w:b/>
+                <w:i w:val="0"/>
+                <w:sz w:val="19"/>
+              </w:rPr>
+              <w:t>Experimental Design</w:t>
+            </w:r>
+            <w:r>
+              <w:rPr>
+                <w:b w:val="0"/>
+                <w:i w:val="0"/>
+                <w:sz w:val="19"/>
+              </w:rPr>
+              <w:t xml:space="preserve"> is set to </w:t>
+            </w:r>
+            <w:r>
+              <w:rPr>
+                <w:b w:val="0"/>
+                <w:i/>
+                <w:sz w:val="19"/>
+              </w:rPr>
+              <w:t>Repeated Measures</w:t>
+            </w:r>
+            <w:r>
+              <w:rPr>
+                <w:b w:val="0"/>
+                <w:i w:val="0"/>
+                <w:sz w:val="19"/>
+              </w:rPr>
+              <w:t xml:space="preserve"> with a genuine pre-test phase — a paired pre/post comparison reusing the same control pair Unbiased Analytics uses</w:t>
+            </w:r>
+          </w:p>
+        </w:tc>
+      </w:tr>
+      <w:tr>
+        <w:tc>
+          <w:tcPr>
+            <w:tcW w:type="dxa" w:w="3120"/>
+          </w:tcPr>
+          <w:p>
+            <w:pPr>
+              <w:spacing w:before="40" w:after="40"/>
+            </w:pPr>
+            <w:r>
+              <w:rPr>
+                <w:b w:val="0"/>
+                <w:i w:val="0"/>
+                <w:sz w:val="19"/>
+              </w:rPr>
+              <w:t>Approach/Avoid Events</w:t>
+            </w:r>
+          </w:p>
+        </w:tc>
+        <w:tc>
+          <w:tcPr>
+            <w:tcW w:type="dxa" w:w="3120"/>
+          </w:tcPr>
+          <w:p>
+            <w:pPr>
+              <w:spacing w:before="40" w:after="40"/>
+            </w:pPr>
+            <w:r>
+              <w:rPr>
+                <w:b w:val="0"/>
+                <w:i w:val="0"/>
+                <w:sz w:val="19"/>
+              </w:rPr>
+              <w:t>All paradigms</w:t>
+            </w:r>
+          </w:p>
+        </w:tc>
+        <w:tc>
+          <w:tcPr>
+            <w:tcW w:type="dxa" w:w="3120"/>
+          </w:tcPr>
+          <w:p>
+            <w:pPr>
+              <w:spacing w:before="40" w:after="40"/>
+            </w:pPr>
+            <w:r>
+              <w:rPr>
+                <w:b w:val="0"/>
+                <w:i w:val="0"/>
+                <w:sz w:val="19"/>
+              </w:rPr>
+              <w:t xml:space="preserve">Trajectory plot with each detected event drawn as a start→end arrow (green = approach, red = avoid), event rate, target distribution. </w:t>
+            </w:r>
+            <w:r>
+              <w:rPr>
+                <w:b/>
+                <w:i w:val="0"/>
+                <w:sz w:val="19"/>
+              </w:rPr>
+              <w:t>This sub-view is a rule-based heuristic, not yet validated against expert human scoring</w:t>
+            </w:r>
+            <w:r>
+              <w:rPr>
+                <w:b w:val="0"/>
+                <w:i w:val="0"/>
+                <w:sz w:val="19"/>
+              </w:rPr>
+              <w:t xml:space="preserve"> — treat it as a starting point for review, not a confirmed classification</w:t>
+            </w:r>
+          </w:p>
+        </w:tc>
+      </w:tr>
+    </w:tbl>
+    <w:p/>
+    <w:p>
+      <w:pPr>
+        <w:spacing w:after="120"/>
+      </w:pPr>
+      <w:r>
+        <w:rPr>
+          <w:b w:val="0"/>
+          <w:i w:val="0"/>
+        </w:rPr>
+        <w:t xml:space="preserve">Every sub-view also shows the </w:t>
+      </w:r>
+      <w:r>
+        <w:rPr>
+          <w:b/>
+          <w:i w:val="0"/>
+        </w:rPr>
+        <w:t>cluster-by-region</w:t>
+      </w:r>
+      <w:r>
+        <w:rPr>
+          <w:b w:val="0"/>
+          <w:i w:val="0"/>
+        </w:rPr>
+        <w:t xml:space="preserve"> and </w:t>
+      </w:r>
+      <w:r>
+        <w:rPr>
+          <w:b/>
+          <w:i w:val="0"/>
+        </w:rPr>
+        <w:t>group-by-region occupancy cross-tab</w:t>
+      </w:r>
+      <w:r>
+        <w:rPr>
+          <w:b w:val="0"/>
+          <w:i w:val="0"/>
+        </w:rPr>
+        <w:t xml:space="preserve"> (grouped bar charts of % time each HDBSCAN cluster or experimental group spends in each traced region), built once and shared across all seven.</w:t>
+      </w:r>
+    </w:p>
+    <w:p>
+      <w:pPr>
+        <w:spacing w:after="120"/>
+      </w:pPr>
+      <w:r>
+        <w:rPr>
+          <w:b/>
+          <w:i w:val="0"/>
+        </w:rPr>
+        <w:t>Statistics:</w:t>
+      </w:r>
+      <w:r>
+        <w:rPr>
+          <w:b w:val="0"/>
+          <w:i w:val="0"/>
+        </w:rPr>
+        <w:t xml:space="preserve"> between-group comparisons reuse the same Kruskal-Wallis/Dunn's machinery (and BH-FDR correction) as Unbiased Analytics. Discrimination Index and CPP additionally get a </w:t>
+      </w:r>
+      <w:r>
+        <w:rPr>
+          <w:b/>
+          <w:i w:val="0"/>
+        </w:rPr>
+        <w:t>one-sample test against a fixed reference</w:t>
+      </w:r>
+      <w:r>
+        <w:rPr>
+          <w:b w:val="0"/>
+          <w:i w:val="0"/>
+        </w:rPr>
+        <w:t xml:space="preserve"> (chance level, or zero delta) — shown with a dagger (†/††/†††) marker, visually distinct from the star (</w:t>
+      </w:r>
+      <w:r>
+        <w:rPr>
+          <w:b w:val="0"/>
+          <w:i/>
+        </w:rPr>
+        <w:t>/</w:t>
+      </w:r>
+      <w:r>
+        <w:rPr>
+          <w:b w:val="0"/>
+          <w:i/>
+        </w:rPr>
+        <w:t>/</w:t>
+      </w:r>
+      <w:r>
+        <w:rPr>
+          <w:b w:val="0"/>
+          <w:i w:val="0"/>
+        </w:rPr>
+        <w:t>**) convention used for between-group brackets, so the two different questions ("does this differ between groups" vs. "does this differ from chance/zero") are never visually conflated.</w:t>
+      </w:r>
+    </w:p>
+    <w:p>
+      <w:pPr>
+        <w:spacing w:after="120"/>
+      </w:pPr>
+      <w:r>
+        <w:rPr>
+          <w:b/>
+          <w:i w:val="0"/>
+        </w:rPr>
+        <w:t>Occupancy heatmaps</w:t>
+      </w:r>
+      <w:r>
+        <w:rPr>
+          <w:b w:val="0"/>
+          <w:i w:val="0"/>
+        </w:rPr>
+        <w:t xml:space="preserve"> show real 2D position density (viridis colormap). Region/object outlines drawn on top are an </w:t>
+      </w:r>
+      <w:r>
+        <w:rPr>
+          <w:b w:val="0"/>
+          <w:i/>
+        </w:rPr>
+        <w:t>approximation</w:t>
+      </w:r>
+      <w:r>
+        <w:rPr>
+          <w:b w:val="0"/>
+          <w:i w:val="0"/>
+        </w:rPr>
+        <w:t xml:space="preserve"> — the convex hull of positions actually recorded in that region/near that object — not the exact traced boundary, since the traced shape's own vertices aren't saved to any output file. Labeled "(approx.)" in the plot.</w:t>
+      </w:r>
+    </w:p>
+    <w:p>
+      <w:pPr>
+        <w:spacing w:after="120"/>
+      </w:pPr>
+      <w:r>
+        <w:rPr>
+          <w:b/>
+          <w:i w:val="0"/>
+        </w:rPr>
+        <w:t>Save All Results</w:t>
+      </w:r>
+      <w:r>
+        <w:rPr>
+          <w:b w:val="0"/>
+          <w:i w:val="0"/>
+        </w:rPr>
+        <w:t xml:space="preserve"> (Combined Analysis tab) includes every applicable Paradigm Results sub-view's figures and a </w:t>
+      </w:r>
+      <w:r>
+        <w:rPr>
+          <w:rFonts w:ascii="Courier New" w:hAnsi="Courier New"/>
+          <w:color w:val="C0392B"/>
+          <w:sz w:val="18"/>
+        </w:rPr>
+        <w:t>paradigm_derived_metrics.csv</w:t>
+      </w:r>
+      <w:r>
+        <w:rPr>
+          <w:b w:val="0"/>
+          <w:i w:val="0"/>
+        </w:rPr>
+        <w:t xml:space="preserve"> summary, alongside the other tabs' output.</w:t>
+      </w:r>
+    </w:p>
+    <w:p>
+      <w:pPr>
+        <w:spacing w:after="120"/>
+      </w:pPr>
+      <w:r>
+        <w:rPr>
+          <w:b w:val="0"/>
+          <w:i/>
+        </w:rPr>
+        <w:t>This tab requires Environmental Context tracing — see "Environmental Context &amp; Object Interaction" in the Advanced Settings section for how to trace an arena and pick a paradigm before running the pipeline.</w:t>
       </w:r>
     </w:p>
     <w:p>

</xml_diff>

<commit_message>
feat: consolidate environments/objects/paradigms into standalone window, fix crop-enable and boundary/threshold validation bugs
</commit_message>
<xml_diff>
--- a/CUBE_Complete_Guide.docx
+++ b/CUBE_Complete_Guide.docx
@@ -10862,7 +10862,7 @@
           <w:b w:val="0"/>
           <w:i w:val="0"/>
         </w:rPr>
-        <w:t xml:space="preserve">, see Advanced Settings) and has a real </w:t>
+        <w:t xml:space="preserve">, see "Environments, Objects, Paradigms" on the main window) and has a real </w:t>
       </w:r>
       <w:r>
         <w:rPr>
@@ -11685,7 +11685,7 @@
           <w:b w:val="0"/>
           <w:i/>
         </w:rPr>
-        <w:t>This tab requires Environmental Context tracing — see "Environmental Context &amp; Object Interaction" in the Advanced Settings section for how to trace an arena and pick a paradigm before running the pipeline.</w:t>
+        <w:t>This tab requires Environmental Context tracing — see "Environmental Context &amp; Object Interaction" below for how to trace an arena and pick a paradigm before running the pipeline.</w:t>
       </w:r>
     </w:p>
     <w:p>
@@ -15161,7 +15161,21 @@
           <w:b w:val="0"/>
           <w:i w:val="0"/>
         </w:rPr>
-        <w:t xml:space="preserve">'s auto-threshold trigger it never flips itself on based on data characteristics). Set </w:t>
+        <w:t xml:space="preserve">'s auto-threshold trigger it never flips itself on based on data characteristics). Toggled from the main window's </w:t>
+      </w:r>
+      <w:r>
+        <w:rPr>
+          <w:b/>
+          <w:i w:val="0"/>
+        </w:rPr>
+        <w:t>Environments, Objects, Paradigms...</w:t>
+      </w:r>
+      <w:r>
+        <w:rPr>
+          <w:b w:val="0"/>
+          <w:i w:val="0"/>
+        </w:rPr>
+        <w:t xml:space="preserve"> button, next to Environmental Context — enabling both together also unlocks approach/avoid object-interaction events (see below). Set </w:t>
       </w:r>
       <w:r>
         <w:rPr>
@@ -15582,36 +15596,35 @@
           <w:b w:val="0"/>
           <w:i w:val="0"/>
         </w:rPr>
-        <w:t xml:space="preserve"> above). Set </w:t>
-      </w:r>
-      <w:r>
-        <w:rPr>
-          <w:rFonts w:ascii="Courier New" w:hAnsi="Courier New"/>
-          <w:color w:val="C0392B"/>
-          <w:sz w:val="18"/>
-        </w:rPr>
-        <w:t>True</w:t>
-      </w:r>
-      <w:r>
-        <w:rPr>
-          <w:b w:val="0"/>
-          <w:i w:val="0"/>
-        </w:rPr>
-        <w:t xml:space="preserve"> in Advanced Settings to reveal the </w:t>
+        <w:t xml:space="preserve"> above). Set from the main window's </w:t>
       </w:r>
       <w:r>
         <w:rPr>
           <w:b/>
           <w:i w:val="0"/>
         </w:rPr>
-        <w:t>Environmental Context...</w:t>
-      </w:r>
-      <w:r>
-        <w:rPr>
-          <w:b w:val="0"/>
-          <w:i w:val="0"/>
-        </w:rPr>
-        <w:t xml:space="preserve"> button (disabled/greyed-out while the checkbox is off), which opens </w:t>
+        <w:t>Environments, Objects, Paradigms...</w:t>
+      </w:r>
+      <w:r>
+        <w:rPr>
+          <w:b w:val="0"/>
+          <w:i w:val="0"/>
+        </w:rPr>
+        <w:t xml:space="preserve"> button (not nested inside Advanced CUBE Analysis), which also holds the interaction-threshold field, an auto-threshold preview, and kinematic directedness — ticking the checkbox there enables the </w:t>
+      </w:r>
+      <w:r>
+        <w:rPr>
+          <w:b/>
+          <w:i w:val="0"/>
+        </w:rPr>
+        <w:t>Configure Arena, Regions &amp; Objects...</w:t>
+      </w:r>
+      <w:r>
+        <w:rPr>
+          <w:b w:val="0"/>
+          <w:i w:val="0"/>
+        </w:rPr>
+        <w:t xml:space="preserve"> button, which opens </w:t>
       </w:r>
       <w:r>
         <w:rPr>
@@ -15706,7 +15719,7 @@
           <w:b w:val="0"/>
           <w:i w:val="0"/>
         </w:rPr>
-        <w:t xml:space="preserve">; needs &gt;= 3 points, or 2 for a boundary). Each paradigm shows its typically-needed tool(s) expanded by default, with the other tucked under a collapsed </w:t>
+        <w:t xml:space="preserve">; every shape, including the boundary, needs &gt;= 3 points — a 2-point "boundary" can't form a closed region). Each paradigm shows its typically-needed tool(s) expanded by default, with the other tucked under a collapsed </w:t>
       </w:r>
       <w:r>
         <w:rPr>
@@ -15897,7 +15910,21 @@
           <w:b w:val="0"/>
           <w:i w:val="0"/>
         </w:rPr>
-        <w:t>length" pixel distance per session from that session's own tracked spine length, used as the object-contact threshold for interaction-bout detection. Enter a specific pixel value in Advanced Settings to override.</w:t>
+        <w:t xml:space="preserve">length" pixel distance per session from that session's own tracked spine length, used as the object-contact threshold for interaction-bout detection. Enter a specific positive pixel value in the Environments, Objects, Paradigms window to override, or click </w:t>
+      </w:r>
+      <w:r>
+        <w:rPr>
+          <w:b/>
+          <w:i w:val="0"/>
+        </w:rPr>
+        <w:t>Preview auto value</w:t>
+      </w:r>
+      <w:r>
+        <w:rPr>
+          <w:b w:val="0"/>
+          <w:i w:val="0"/>
+        </w:rPr>
+        <w:t xml:space="preserve"> to see what the auto-derived value would be for this project's first paired DLC file before deciding.</w:t>
       </w:r>
     </w:p>
     <w:p>

</xml_diff>

<commit_message>
docs: update env/paradigm docs for the new standalone Environments, Objects, Paradigms window
</commit_message>
<xml_diff>
--- a/CUBE_Complete_Guide.docx
+++ b/CUBE_Complete_Guide.docx
@@ -33844,7 +33844,23 @@
                 <w:i w:val="0"/>
                 <w:sz w:val="19"/>
               </w:rPr>
-              <w:t xml:space="preserve">Open Advanced Settings → tick </w:t>
+              <w:t xml:space="preserve">Main window → </w:t>
+            </w:r>
+            <w:r>
+              <w:rPr>
+                <w:b/>
+                <w:i w:val="0"/>
+                <w:sz w:val="19"/>
+              </w:rPr>
+              <w:t>Environments, Objects, Paradigms...</w:t>
+            </w:r>
+            <w:r>
+              <w:rPr>
+                <w:b w:val="0"/>
+                <w:i w:val="0"/>
+                <w:sz w:val="19"/>
+              </w:rPr>
+              <w:t xml:space="preserve"> → tick </w:t>
             </w:r>
             <w:r>
               <w:rPr>
@@ -33868,7 +33884,7 @@
                 <w:i w:val="0"/>
                 <w:sz w:val="19"/>
               </w:rPr>
-              <w:t>Environmental Context...</w:t>
+              <w:t>Configure Arena, Regions &amp; Objects...</w:t>
             </w:r>
             <w:r>
               <w:rPr>
@@ -33876,7 +33892,7 @@
                 <w:i w:val="0"/>
                 <w:sz w:val="19"/>
               </w:rPr>
-              <w:t xml:space="preserve"> button → </w:t>
+              <w:t xml:space="preserve"> → </w:t>
             </w:r>
             <w:r>
               <w:rPr>
@@ -34094,7 +34110,23 @@
                 <w:i w:val="0"/>
                 <w:sz w:val="19"/>
               </w:rPr>
-              <w:t>4. Optional, same Advanced Settings section</w:t>
+              <w:t xml:space="preserve">4. Same </w:t>
+            </w:r>
+            <w:r>
+              <w:rPr>
+                <w:b/>
+                <w:i w:val="0"/>
+                <w:sz w:val="19"/>
+              </w:rPr>
+              <w:t>Environments, Objects, Paradigms...</w:t>
+            </w:r>
+            <w:r>
+              <w:rPr>
+                <w:b w:val="0"/>
+                <w:i w:val="0"/>
+                <w:sz w:val="19"/>
+              </w:rPr>
+              <w:t xml:space="preserve"> window</w:t>
             </w:r>
           </w:p>
         </w:tc>

</xml_diff>

<commit_message>
docs: regenerate CUBE_Complete_Guide.docx with DLC settings-audit fix notes
Reflects CUBE_GUIDE.md's updated Step 1 section: Smart Adapt now on by
default, 5 settings that previously only worked in the regular per-video
path now also apply to Smart Adapt (pseudo threshold, scale mode, det
batch, transfer learning, adapt epochs), new dlcrnet architecture option,
raised epoch-slider ceiling.
</commit_message>
<xml_diff>
--- a/CUBE_Complete_Guide.docx
+++ b/CUBE_Complete_Guide.docx
@@ -1357,7 +1357,73 @@
           <w:i w:val="0"/>
           <w:sz w:val="21"/>
         </w:rPr>
-        <w:t xml:space="preserve"> — adapts the model once on a representative video, then reuses the adapted weights for all remaining videos. Recommended for large batches where animals all look similar.</w:t>
+        <w:t xml:space="preserve"> — adapts the model once on a representative video, then reuses the adapted weights for all remaining videos. Recommended for large batches where animals all look similar. </w:t>
+      </w:r>
+      <w:r>
+        <w:rPr>
+          <w:b/>
+          <w:i w:val="0"/>
+          <w:sz w:val="21"/>
+        </w:rPr>
+        <w:t>On by default</w:t>
+      </w:r>
+      <w:r>
+        <w:rPr>
+          <w:b w:val="0"/>
+          <w:i w:val="0"/>
+          <w:sz w:val="21"/>
+        </w:rPr>
+        <w:t xml:space="preserve"> as of the settings-audit fix below.</w:t>
+      </w:r>
+    </w:p>
+    <w:p>
+      <w:pPr>
+        <w:pStyle w:val="IntenseQuote"/>
+        <w:spacing w:before="80" w:after="80"/>
+      </w:pPr>
+      <w:r>
+        <w:rPr>
+          <w:b/>
+          <w:i/>
+        </w:rPr>
+        <w:t>Settings-audit fix:</w:t>
+      </w:r>
+      <w:r>
+        <w:rPr>
+          <w:b w:val="0"/>
+          <w:i/>
+        </w:rPr>
+        <w:t xml:space="preserve"> Smart Adapt previously ignored several settings that only worked in the regular per-video "Video adapt" path — Pseudo threshold, Scale mode (Auto/Manual), Det batch size, Transfer learning, and the "Adapt epochs" slider (Advanced dialog's Det/Pose epoch spinboxes silently took over). All five now apply to Smart Adapt exactly as they do to the regular path. </w:t>
+      </w:r>
+      <w:r>
+        <w:rPr>
+          <w:rFonts w:ascii="Courier New" w:hAnsi="Courier New"/>
+          <w:color w:val="C0392B"/>
+          <w:sz w:val="18"/>
+        </w:rPr>
+        <w:t>AdvancedDLCWindow</w:t>
+      </w:r>
+      <w:r>
+        <w:rPr>
+          <w:b w:val="0"/>
+          <w:i/>
+        </w:rPr>
+        <w:t xml:space="preserve">'s Architecture list also gained </w:t>
+      </w:r>
+      <w:r>
+        <w:rPr>
+          <w:rFonts w:ascii="Courier New" w:hAnsi="Courier New"/>
+          <w:color w:val="C0392B"/>
+          <w:sz w:val="18"/>
+        </w:rPr>
+        <w:t>dlcrnet</w:t>
+      </w:r>
+      <w:r>
+        <w:rPr>
+          <w:b w:val="0"/>
+          <w:i/>
+        </w:rPr>
+        <w:t xml:space="preserve"> (DLC's bottom-up TensorFlow-engine option), and the "Adapt epochs" slider ceiling was raised from 30 to 200 to match the Advanced dialog's Det/Pose epoch spinboxes.</w:t>
       </w:r>
     </w:p>
     <w:p>

</xml_diff>

<commit_message>
docs(region-refine): document region-aware cluster splitting
Updates README.md (v5 Feature Summary + Output Layout), CUBE_GUIDE.md
(new Region-Aware Cluster Splitting subsection under Environmental
Context, plus a troubleshooting entry), and CUBE_ANALYSIS_METHODOLOGY.md
(new Section 7 plus a linking row in Section 2s refinement table) for the
full 8-phase region-aware cluster refinement feature.

CUBE_GUIDE.md itself is gitignored (local working source combined into
CUBE_Complete_Guide.docx by md_to_docx.py) -- its edits are folded into
the regenerated CUBE_Complete_Guide.docx included in this commit.
CUBE_ANALYSIS_METHODOLOGY.docx was also regenerated but follows the
existing blanket *.docx gitignore rule (only CUBE_Complete_Guide.docx is
a tracked exception), so it is not committed, matching current repo
convention.
</commit_message>
<xml_diff>
--- a/CUBE_Complete_Guide.docx
+++ b/CUBE_Complete_Guide.docx
@@ -16386,6 +16386,786 @@
           <w:color w:val="1F497D"/>
           <w:sz w:val="24"/>
         </w:rPr>
+        <w:t>Region-Aware Cluster Splitting (opt-in, new)</w:t>
+      </w:r>
+    </w:p>
+    <w:p>
+      <w:pPr>
+        <w:spacing w:after="120"/>
+      </w:pPr>
+      <w:r>
+        <w:rPr>
+          <w:b w:val="0"/>
+          <w:i w:val="0"/>
+        </w:rPr>
+        <w:t xml:space="preserve">An additional split pass in the same iterative split/merge refinement loop (see the section above), controlled from the </w:t>
+      </w:r>
+      <w:r>
+        <w:rPr>
+          <w:b/>
+          <w:i w:val="0"/>
+        </w:rPr>
+        <w:t>same Environments, Objects, Paradigms... window</w:t>
+      </w:r>
+      <w:r>
+        <w:rPr>
+          <w:b w:val="0"/>
+          <w:i w:val="0"/>
+        </w:rPr>
+        <w:t xml:space="preserve"> as the environmental-context settings, since it reads the traced arena directly — it does </w:t>
+      </w:r>
+      <w:r>
+        <w:rPr>
+          <w:b/>
+          <w:i w:val="0"/>
+        </w:rPr>
+        <w:t>not</w:t>
+      </w:r>
+      <w:r>
+        <w:rPr>
+          <w:b w:val="0"/>
+          <w:i w:val="0"/>
+        </w:rPr>
+        <w:t xml:space="preserve"> require </w:t>
+      </w:r>
+      <w:r>
+        <w:rPr>
+          <w:rFonts w:ascii="Courier New" w:hAnsi="Courier New"/>
+          <w:color w:val="C0392B"/>
+          <w:sz w:val="18"/>
+        </w:rPr>
+        <w:t>env_features_enabled</w:t>
+      </w:r>
+      <w:r>
+        <w:rPr>
+          <w:b w:val="0"/>
+          <w:i w:val="0"/>
+        </w:rPr>
+        <w:t xml:space="preserve"> to also be on.</w:t>
+      </w:r>
+    </w:p>
+    <w:p>
+      <w:pPr>
+        <w:pStyle w:val="ListBullet"/>
+      </w:pPr>
+      <w:r>
+        <w:rPr>
+          <w:b/>
+          <w:i w:val="0"/>
+          <w:sz w:val="21"/>
+        </w:rPr>
+        <w:t>`hdbscan_region_split_enabled`</w:t>
+      </w:r>
+      <w:r>
+        <w:rPr>
+          <w:b w:val="0"/>
+          <w:i w:val="0"/>
+          <w:sz w:val="21"/>
+        </w:rPr>
+        <w:t xml:space="preserve"> — </w:t>
+      </w:r>
+      <w:r>
+        <w:rPr>
+          <w:rFonts w:ascii="Courier New" w:hAnsi="Courier New"/>
+          <w:color w:val="C0392B"/>
+          <w:sz w:val="18"/>
+        </w:rPr>
+        <w:t>False</w:t>
+      </w:r>
+      <w:r>
+        <w:rPr>
+          <w:b w:val="0"/>
+          <w:i w:val="0"/>
+          <w:sz w:val="21"/>
+        </w:rPr>
+        <w:t xml:space="preserve"> (default, opt-in). Checkbox: "Enable region-aware cluster</w:t>
+      </w:r>
+    </w:p>
+    <w:p>
+      <w:pPr>
+        <w:spacing w:after="120"/>
+      </w:pPr>
+      <w:r>
+        <w:rPr>
+          <w:b w:val="0"/>
+          <w:i w:val="0"/>
+        </w:rPr>
+        <w:t xml:space="preserve">splitting (opt-in)". Flags a cluster for splitting when its bins are spatially impure with respect to traced arena regions (e.g. a cluster that is 85% Periphery / 15% Center time might be two behaviourally distinct sub-clusters) and locally re-clusters just that cluster on its kinematic features — region data never enters UMAP/HDBSCAN itself, it only decides </w:t>
+      </w:r>
+      <w:r>
+        <w:rPr>
+          <w:b w:val="0"/>
+          <w:i/>
+        </w:rPr>
+        <w:t>which</w:t>
+      </w:r>
+      <w:r>
+        <w:rPr>
+          <w:b w:val="0"/>
+          <w:i w:val="0"/>
+        </w:rPr>
+        <w:t xml:space="preserve"> clusters attempt a local re-cluster; the local re-clustering and its acceptance are governed purely by HDBSCAN/DBCV, exactly like the existing silhouette-based split. Requires an arena with traced regions (</w:t>
+      </w:r>
+      <w:r>
+        <w:rPr>
+          <w:b/>
+          <w:i w:val="0"/>
+        </w:rPr>
+        <w:t>Configure Arena, Regions &amp; Objects...</w:t>
+      </w:r>
+      <w:r>
+        <w:rPr>
+          <w:b w:val="0"/>
+          <w:i w:val="0"/>
+        </w:rPr>
+        <w:t xml:space="preserve"> in the same window) — with the flag on but nothing traced, this is still a true no-op (no refinement loop runs, no log lines).</w:t>
+      </w:r>
+    </w:p>
+    <w:p>
+      <w:pPr>
+        <w:pStyle w:val="ListBullet"/>
+      </w:pPr>
+      <w:r>
+        <w:rPr>
+          <w:b/>
+          <w:i w:val="0"/>
+          <w:sz w:val="21"/>
+        </w:rPr>
+        <w:t>Impurity threshold (entropy 0-1)</w:t>
+      </w:r>
+      <w:r>
+        <w:rPr>
+          <w:b w:val="0"/>
+          <w:i w:val="0"/>
+          <w:sz w:val="21"/>
+        </w:rPr>
+        <w:t xml:space="preserve"> (</w:t>
+      </w:r>
+      <w:r>
+        <w:rPr>
+          <w:rFonts w:ascii="Courier New" w:hAnsi="Courier New"/>
+          <w:color w:val="C0392B"/>
+          <w:sz w:val="18"/>
+        </w:rPr>
+        <w:t>hdbscan_region_split_impurity_thresh</w:t>
+      </w:r>
+      <w:r>
+        <w:rPr>
+          <w:b w:val="0"/>
+          <w:i w:val="0"/>
+          <w:sz w:val="21"/>
+        </w:rPr>
+        <w:t xml:space="preserve">, default </w:t>
+      </w:r>
+      <w:r>
+        <w:rPr>
+          <w:rFonts w:ascii="Courier New" w:hAnsi="Courier New"/>
+          <w:color w:val="C0392B"/>
+          <w:sz w:val="18"/>
+        </w:rPr>
+        <w:t>0.5</w:t>
+      </w:r>
+      <w:r>
+        <w:rPr>
+          <w:b w:val="0"/>
+          <w:i w:val="0"/>
+          <w:sz w:val="21"/>
+        </w:rPr>
+        <w:t>) — normalized</w:t>
+      </w:r>
+    </w:p>
+    <w:p>
+      <w:pPr>
+        <w:spacing w:after="120"/>
+      </w:pPr>
+      <w:r>
+        <w:rPr>
+          <w:b w:val="0"/>
+          <w:i w:val="0"/>
+        </w:rPr>
+        <w:t>Shannon entropy of a cluster's region-label distribution (0 = single region, 1 = maximally mixed) at/above which a cluster becomes a split candidate.</w:t>
+      </w:r>
+    </w:p>
+    <w:p>
+      <w:pPr>
+        <w:pStyle w:val="ListBullet"/>
+      </w:pPr>
+      <w:r>
+        <w:rPr>
+          <w:b/>
+          <w:i w:val="0"/>
+          <w:sz w:val="21"/>
+        </w:rPr>
+        <w:t>Minority region floor (0-1)</w:t>
+      </w:r>
+      <w:r>
+        <w:rPr>
+          <w:b w:val="0"/>
+          <w:i w:val="0"/>
+          <w:sz w:val="21"/>
+        </w:rPr>
+        <w:t xml:space="preserve"> (</w:t>
+      </w:r>
+      <w:r>
+        <w:rPr>
+          <w:rFonts w:ascii="Courier New" w:hAnsi="Courier New"/>
+          <w:color w:val="C0392B"/>
+          <w:sz w:val="18"/>
+        </w:rPr>
+        <w:t>hdbscan_region_split_min_minority_frac</w:t>
+      </w:r>
+      <w:r>
+        <w:rPr>
+          <w:b w:val="0"/>
+          <w:i w:val="0"/>
+          <w:sz w:val="21"/>
+        </w:rPr>
+        <w:t xml:space="preserve">, default </w:t>
+      </w:r>
+      <w:r>
+        <w:rPr>
+          <w:rFonts w:ascii="Courier New" w:hAnsi="Courier New"/>
+          <w:color w:val="C0392B"/>
+          <w:sz w:val="18"/>
+        </w:rPr>
+        <w:t>0.15</w:t>
+      </w:r>
+      <w:r>
+        <w:rPr>
+          <w:b w:val="0"/>
+          <w:i w:val="0"/>
+          <w:sz w:val="21"/>
+        </w:rPr>
+        <w:t>) — every</w:t>
+      </w:r>
+    </w:p>
+    <w:p>
+      <w:pPr>
+        <w:spacing w:after="120"/>
+      </w:pPr>
+      <w:r>
+        <w:rPr>
+          <w:b w:val="0"/>
+          <w:i w:val="0"/>
+        </w:rPr>
+        <w:t>non-dominant region in a candidate cluster must represent at least this fraction of the cluster's bins, or the cluster is not split (avoids forcing noise-level region contamination, e.g. 1% of bins, into its own fragment).</w:t>
+      </w:r>
+    </w:p>
+    <w:p>
+      <w:pPr>
+        <w:pStyle w:val="ListBullet"/>
+      </w:pPr>
+      <w:r>
+        <w:rPr>
+          <w:b/>
+          <w:i w:val="0"/>
+          <w:sz w:val="21"/>
+        </w:rPr>
+        <w:t>Max sub-clusters per split</w:t>
+      </w:r>
+      <w:r>
+        <w:rPr>
+          <w:b w:val="0"/>
+          <w:i w:val="0"/>
+          <w:sz w:val="21"/>
+        </w:rPr>
+        <w:t xml:space="preserve"> (</w:t>
+      </w:r>
+      <w:r>
+        <w:rPr>
+          <w:rFonts w:ascii="Courier New" w:hAnsi="Courier New"/>
+          <w:color w:val="C0392B"/>
+          <w:sz w:val="18"/>
+        </w:rPr>
+        <w:t>hdbscan_region_split_max_subclusters</w:t>
+      </w:r>
+      <w:r>
+        <w:rPr>
+          <w:b w:val="0"/>
+          <w:i w:val="0"/>
+          <w:sz w:val="21"/>
+        </w:rPr>
+        <w:t xml:space="preserve">, default </w:t>
+      </w:r>
+      <w:r>
+        <w:rPr>
+          <w:rFonts w:ascii="Courier New" w:hAnsi="Courier New"/>
+          <w:color w:val="C0392B"/>
+          <w:sz w:val="18"/>
+        </w:rPr>
+        <w:t>3</w:t>
+      </w:r>
+      <w:r>
+        <w:rPr>
+          <w:b w:val="0"/>
+          <w:i w:val="0"/>
+          <w:sz w:val="21"/>
+        </w:rPr>
+        <w:t>) and **Max split</w:t>
+      </w:r>
+    </w:p>
+    <w:p>
+      <w:pPr>
+        <w:spacing w:after="120"/>
+      </w:pPr>
+      <w:r>
+        <w:rPr>
+          <w:b w:val="0"/>
+          <w:i w:val="0"/>
+        </w:rPr>
+        <w:t>candidates per pass** (</w:t>
+      </w:r>
+      <w:r>
+        <w:rPr>
+          <w:rFonts w:ascii="Courier New" w:hAnsi="Courier New"/>
+          <w:color w:val="C0392B"/>
+          <w:sz w:val="18"/>
+        </w:rPr>
+        <w:t>hdbscan_region_split_max_candidates</w:t>
+      </w:r>
+      <w:r>
+        <w:rPr>
+          <w:b w:val="0"/>
+          <w:i w:val="0"/>
+        </w:rPr>
+        <w:t xml:space="preserve">, default </w:t>
+      </w:r>
+      <w:r>
+        <w:rPr>
+          <w:rFonts w:ascii="Courier New" w:hAnsi="Courier New"/>
+          <w:color w:val="C0392B"/>
+          <w:sz w:val="18"/>
+        </w:rPr>
+        <w:t>10</w:t>
+      </w:r>
+      <w:r>
+        <w:rPr>
+          <w:b w:val="0"/>
+          <w:i w:val="0"/>
+        </w:rPr>
+        <w:t>) — mirror the equivalent silhouette-split settings; bound how far a single pass can fragment one cluster and how many candidates are attempted per iteration (worst-impurity-first).</w:t>
+      </w:r>
+    </w:p>
+    <w:p>
+      <w:pPr>
+        <w:pStyle w:val="ListBullet"/>
+      </w:pPr>
+      <w:r>
+        <w:rPr>
+          <w:b/>
+          <w:i w:val="0"/>
+          <w:sz w:val="21"/>
+        </w:rPr>
+        <w:t>Pre-reduction % (0 = off)</w:t>
+      </w:r>
+      <w:r>
+        <w:rPr>
+          <w:b w:val="0"/>
+          <w:i w:val="0"/>
+          <w:sz w:val="21"/>
+        </w:rPr>
+        <w:t xml:space="preserve"> (</w:t>
+      </w:r>
+      <w:r>
+        <w:rPr>
+          <w:rFonts w:ascii="Courier New" w:hAnsi="Courier New"/>
+          <w:color w:val="C0392B"/>
+          <w:sz w:val="18"/>
+        </w:rPr>
+        <w:t>region_split_pre_reduction_pct</w:t>
+      </w:r>
+      <w:r>
+        <w:rPr>
+          <w:b w:val="0"/>
+          <w:i w:val="0"/>
+          <w:sz w:val="21"/>
+        </w:rPr>
+        <w:t xml:space="preserve">, default </w:t>
+      </w:r>
+      <w:r>
+        <w:rPr>
+          <w:rFonts w:ascii="Courier New" w:hAnsi="Courier New"/>
+          <w:color w:val="C0392B"/>
+          <w:sz w:val="18"/>
+        </w:rPr>
+        <w:t>0.0</w:t>
+      </w:r>
+      <w:r>
+        <w:rPr>
+          <w:b w:val="0"/>
+          <w:i w:val="0"/>
+          <w:sz w:val="21"/>
+        </w:rPr>
+        <w:t xml:space="preserve">) — when set (e.g. </w:t>
+      </w:r>
+      <w:r>
+        <w:rPr>
+          <w:rFonts w:ascii="Courier New" w:hAnsi="Courier New"/>
+          <w:color w:val="C0392B"/>
+          <w:sz w:val="18"/>
+        </w:rPr>
+        <w:t>0.7</w:t>
+      </w:r>
+      <w:r>
+        <w:rPr>
+          <w:b w:val="0"/>
+          <w:i w:val="0"/>
+          <w:sz w:val="21"/>
+        </w:rPr>
+        <w:t>),</w:t>
+      </w:r>
+    </w:p>
+    <w:p>
+      <w:pPr>
+        <w:spacing w:after="120"/>
+      </w:pPr>
+      <w:r>
+        <w:rPr>
+          <w:b w:val="0"/>
+          <w:i w:val="0"/>
+        </w:rPr>
+        <w:t xml:space="preserve">multiplies the </w:t>
+      </w:r>
+      <w:r>
+        <w:rPr>
+          <w:b w:val="0"/>
+          <w:i/>
+        </w:rPr>
+        <w:t>primary</w:t>
+      </w:r>
+      <w:r>
+        <w:rPr>
+          <w:b w:val="0"/>
+          <w:i w:val="0"/>
+        </w:rPr>
+        <w:t xml:space="preserve"> HDBSCAN sweep's preferred-cluster-count range by this fraction for that sweep only, a one-shot convenience so region-aware splitting has more room to bring the count back up organically — </w:t>
+      </w:r>
+      <w:r>
+        <w:rPr>
+          <w:b/>
+          <w:i w:val="0"/>
+        </w:rPr>
+        <w:t>not</w:t>
+      </w:r>
+      <w:r>
+        <w:rPr>
+          <w:b w:val="0"/>
+          <w:i w:val="0"/>
+        </w:rPr>
+        <w:t xml:space="preserve"> a guaranteed final count, and not a retry loop. Check the run log's </w:t>
+      </w:r>
+      <w:r>
+        <w:rPr>
+          <w:rFonts w:ascii="Courier New" w:hAnsi="Courier New"/>
+          <w:color w:val="C0392B"/>
+          <w:sz w:val="18"/>
+        </w:rPr>
+        <w:t>[region-split] cluster-count trace</w:t>
+      </w:r>
+      <w:r>
+        <w:rPr>
+          <w:b w:val="0"/>
+          <w:i w:val="0"/>
+        </w:rPr>
+        <w:t xml:space="preserve"> line (raw primary sweep → post-refinement → final, after rare-cluster pruning) to see how close the result landed.</w:t>
+      </w:r>
+    </w:p>
+    <w:p>
+      <w:pPr>
+        <w:pStyle w:val="ListBullet"/>
+      </w:pPr>
+      <w:r>
+        <w:rPr>
+          <w:b w:val="0"/>
+          <w:i w:val="0"/>
+          <w:sz w:val="21"/>
+        </w:rPr>
+        <w:t xml:space="preserve">Also active in consensus mode when </w:t>
+      </w:r>
+      <w:r>
+        <w:rPr>
+          <w:rFonts w:ascii="Courier New" w:hAnsi="Courier New"/>
+          <w:color w:val="C0392B"/>
+          <w:sz w:val="18"/>
+        </w:rPr>
+        <w:t>consensus_clustering_enabled</w:t>
+      </w:r>
+      <w:r>
+        <w:rPr>
+          <w:b w:val="0"/>
+          <w:i w:val="0"/>
+          <w:sz w:val="21"/>
+        </w:rPr>
+        <w:t xml:space="preserve"> and </w:t>
+      </w:r>
+      <w:r>
+        <w:rPr>
+          <w:rFonts w:ascii="Courier New" w:hAnsi="Courier New"/>
+          <w:color w:val="C0392B"/>
+          <w:sz w:val="18"/>
+        </w:rPr>
+        <w:t>consensus_refine_enabled</w:t>
+      </w:r>
+      <w:r>
+        <w:rPr>
+          <w:b w:val="0"/>
+          <w:i w:val="0"/>
+          <w:sz w:val="21"/>
+        </w:rPr>
+        <w:t xml:space="preserve"> (on by</w:t>
+      </w:r>
+    </w:p>
+    <w:p>
+      <w:pPr>
+        <w:spacing w:after="120"/>
+      </w:pPr>
+      <w:r>
+        <w:rPr>
+          <w:b w:val="0"/>
+          <w:i w:val="0"/>
+        </w:rPr>
+        <w:t>default whenever consensus runs) are both on, using the same gates.</w:t>
+      </w:r>
+    </w:p>
+    <w:p>
+      <w:pPr>
+        <w:pStyle w:val="ListBullet"/>
+      </w:pPr>
+      <w:r>
+        <w:rPr>
+          <w:b/>
+          <w:i w:val="0"/>
+          <w:sz w:val="21"/>
+        </w:rPr>
+        <w:t>Output</w:t>
+      </w:r>
+      <w:r>
+        <w:rPr>
+          <w:b w:val="0"/>
+          <w:i w:val="0"/>
+          <w:sz w:val="21"/>
+        </w:rPr>
+        <w:t xml:space="preserve">: </w:t>
+      </w:r>
+      <w:r>
+        <w:rPr>
+          <w:rFonts w:ascii="Courier New" w:hAnsi="Courier New"/>
+          <w:color w:val="C0392B"/>
+          <w:sz w:val="18"/>
+        </w:rPr>
+        <w:t>validation_report.json</w:t>
+      </w:r>
+      <w:r>
+        <w:rPr>
+          <w:b w:val="0"/>
+          <w:i w:val="0"/>
+          <w:sz w:val="21"/>
+        </w:rPr>
+        <w:t xml:space="preserve"> gains a </w:t>
+      </w:r>
+      <w:r>
+        <w:rPr>
+          <w:rFonts w:ascii="Courier New" w:hAnsi="Courier New"/>
+          <w:color w:val="C0392B"/>
+          <w:sz w:val="18"/>
+        </w:rPr>
+        <w:t>region_split</w:t>
+      </w:r>
+      <w:r>
+        <w:rPr>
+          <w:b w:val="0"/>
+          <w:i w:val="0"/>
+          <w:sz w:val="21"/>
+        </w:rPr>
+        <w:t xml:space="preserve"> block (</w:t>
+      </w:r>
+      <w:r>
+        <w:rPr>
+          <w:rFonts w:ascii="Courier New" w:hAnsi="Courier New"/>
+          <w:color w:val="C0392B"/>
+          <w:sz w:val="18"/>
+        </w:rPr>
+        <w:t>clusters_created</w:t>
+      </w:r>
+      <w:r>
+        <w:rPr>
+          <w:b w:val="0"/>
+          <w:i w:val="0"/>
+          <w:sz w:val="21"/>
+        </w:rPr>
+        <w:t>,</w:t>
+      </w:r>
+    </w:p>
+    <w:p>
+      <w:pPr>
+        <w:spacing w:after="120"/>
+      </w:pPr>
+      <w:r>
+        <w:rPr>
+          <w:rFonts w:ascii="Courier New" w:hAnsi="Courier New"/>
+          <w:color w:val="C0392B"/>
+          <w:sz w:val="18"/>
+        </w:rPr>
+        <w:t>raw_primary_sweep_n_cl</w:t>
+      </w:r>
+      <w:r>
+        <w:rPr>
+          <w:b w:val="0"/>
+          <w:i w:val="0"/>
+        </w:rPr>
+        <w:t xml:space="preserve">, </w:t>
+      </w:r>
+      <w:r>
+        <w:rPr>
+          <w:rFonts w:ascii="Courier New" w:hAnsi="Courier New"/>
+          <w:color w:val="C0392B"/>
+          <w:sz w:val="18"/>
+        </w:rPr>
+        <w:t>post_refinement_n_cl</w:t>
+      </w:r>
+      <w:r>
+        <w:rPr>
+          <w:b w:val="0"/>
+          <w:i w:val="0"/>
+        </w:rPr>
+        <w:t xml:space="preserve">, </w:t>
+      </w:r>
+      <w:r>
+        <w:rPr>
+          <w:rFonts w:ascii="Courier New" w:hAnsi="Courier New"/>
+          <w:color w:val="C0392B"/>
+          <w:sz w:val="18"/>
+        </w:rPr>
+        <w:t>final_n_cl</w:t>
+      </w:r>
+      <w:r>
+        <w:rPr>
+          <w:b w:val="0"/>
+          <w:i w:val="0"/>
+        </w:rPr>
+        <w:t xml:space="preserve">, </w:t>
+      </w:r>
+      <w:r>
+        <w:rPr>
+          <w:rFonts w:ascii="Courier New" w:hAnsi="Courier New"/>
+          <w:color w:val="C0392B"/>
+          <w:sz w:val="18"/>
+        </w:rPr>
+        <w:t>preferred_clusters_range_original</w:t>
+      </w:r>
+      <w:r>
+        <w:rPr>
+          <w:b w:val="0"/>
+          <w:i w:val="0"/>
+        </w:rPr>
+        <w:t xml:space="preserve">, </w:t>
+      </w:r>
+      <w:r>
+        <w:rPr>
+          <w:rFonts w:ascii="Courier New" w:hAnsi="Courier New"/>
+          <w:color w:val="C0392B"/>
+          <w:sz w:val="18"/>
+        </w:rPr>
+        <w:t>pre_reduction_pct</w:t>
+      </w:r>
+      <w:r>
+        <w:rPr>
+          <w:b w:val="0"/>
+          <w:i w:val="0"/>
+        </w:rPr>
+        <w:t xml:space="preserve">) whenever the flag is on — absent entirely otherwise. </w:t>
+      </w:r>
+      <w:r>
+        <w:rPr>
+          <w:rFonts w:ascii="Courier New" w:hAnsi="Courier New"/>
+          <w:color w:val="C0392B"/>
+          <w:sz w:val="18"/>
+        </w:rPr>
+        <w:t>cluster_hierarchy_*.png</w:t>
+      </w:r>
+      <w:r>
+        <w:rPr>
+          <w:b w:val="0"/>
+          <w:i w:val="0"/>
+        </w:rPr>
+        <w:t xml:space="preserve"> gains an optional per-leaf stacked-bar glyph showing that cluster's region-time composition, plus a star marker on any leaf whose bins trace back to an accepted region-aware split this run — both render in the Analyser's live Cluster Hierarchy view too, from the same persisted </w:t>
+      </w:r>
+      <w:r>
+        <w:rPr>
+          <w:rFonts w:ascii="Courier New" w:hAnsi="Courier New"/>
+          <w:color w:val="C0392B"/>
+          <w:sz w:val="18"/>
+        </w:rPr>
+        <w:t>cluster_feature_centroids.npz</w:t>
+      </w:r>
+      <w:r>
+        <w:rPr>
+          <w:b w:val="0"/>
+          <w:i w:val="0"/>
+        </w:rPr>
+        <w:t>.</w:t>
+      </w:r>
+    </w:p>
+    <w:p>
+      <w:pPr>
+        <w:pStyle w:val="ListBullet"/>
+      </w:pPr>
+      <w:r>
+        <w:rPr>
+          <w:b w:val="0"/>
+          <w:i w:val="0"/>
+          <w:sz w:val="21"/>
+        </w:rPr>
+        <w:t xml:space="preserve">This is the region-aware refinement feature from </w:t>
+      </w:r>
+      <w:r>
+        <w:rPr>
+          <w:rFonts w:ascii="Courier New" w:hAnsi="Courier New"/>
+          <w:color w:val="C0392B"/>
+          <w:sz w:val="18"/>
+        </w:rPr>
+        <w:t>Region_Aware_Refinement_Implementation_Plan.md</w:t>
+      </w:r>
+      <w:r>
+        <w:rPr>
+          <w:b w:val="0"/>
+          <w:i w:val="0"/>
+          <w:sz w:val="21"/>
+        </w:rPr>
+        <w:t>; see</w:t>
+      </w:r>
+    </w:p>
+    <w:p>
+      <w:pPr>
+        <w:spacing w:after="120"/>
+      </w:pPr>
+      <w:r>
+        <w:rPr>
+          <w:rFonts w:ascii="Courier New" w:hAnsi="Courier New"/>
+          <w:color w:val="C0392B"/>
+          <w:sz w:val="18"/>
+        </w:rPr>
+        <w:t>CUBE_ANALYSIS_METHODOLOGY.md</w:t>
+      </w:r>
+      <w:r>
+        <w:rPr>
+          <w:b w:val="0"/>
+          <w:i w:val="0"/>
+        </w:rPr>
+        <w:t xml:space="preserve"> Section 7 for the design rationale.</w:t>
+      </w:r>
+    </w:p>
+    <w:p>
+      <w:pPr>
+        <w:pStyle w:val="Heading3"/>
+        <w:spacing w:before="160" w:after="80"/>
+      </w:pPr>
+      <w:r>
+        <w:rPr>
+          <w:b/>
+          <w:color w:val="1F497D"/>
+          <w:sz w:val="24"/>
+        </w:rPr>
         <w:t>Split-Pass Performance Bounds (Aug 2026)</w:t>
       </w:r>
     </w:p>
@@ -18900,6 +19680,93 @@
           <w:i w:val="0"/>
         </w:rPr>
         <w:t xml:space="preserve"> (the defaults) and re-run.</w:t>
+      </w:r>
+    </w:p>
+    <w:p>
+      <w:pPr>
+        <w:pStyle w:val="ListNumber"/>
+      </w:pPr>
+      <w:r>
+        <w:rPr>
+          <w:b w:val="0"/>
+          <w:i w:val="0"/>
+          <w:sz w:val="21"/>
+        </w:rPr>
+        <w:t xml:space="preserve">If </w:t>
+      </w:r>
+      <w:r>
+        <w:rPr>
+          <w:rFonts w:ascii="Courier New" w:hAnsi="Courier New"/>
+          <w:color w:val="C0392B"/>
+          <w:sz w:val="18"/>
+        </w:rPr>
+        <w:t>hdbscan_region_split_enabled</w:t>
+      </w:r>
+      <w:r>
+        <w:rPr>
+          <w:b w:val="0"/>
+          <w:i w:val="0"/>
+          <w:sz w:val="21"/>
+        </w:rPr>
+        <w:t xml:space="preserve"> is also on, check the </w:t>
+      </w:r>
+      <w:r>
+        <w:rPr>
+          <w:rFonts w:ascii="Courier New" w:hAnsi="Courier New"/>
+          <w:color w:val="C0392B"/>
+          <w:sz w:val="18"/>
+        </w:rPr>
+        <w:t>[region-split]</w:t>
+      </w:r>
+      <w:r>
+        <w:rPr>
+          <w:b w:val="0"/>
+          <w:i w:val="0"/>
+          <w:sz w:val="21"/>
+        </w:rPr>
+        <w:t xml:space="preserve"> log lines specifically — the</w:t>
+      </w:r>
+    </w:p>
+    <w:p>
+      <w:pPr>
+        <w:spacing w:after="120"/>
+      </w:pPr>
+      <w:r>
+        <w:rPr>
+          <w:b w:val="0"/>
+          <w:i w:val="0"/>
+        </w:rPr>
+        <w:t xml:space="preserve">cluster-count trace line shows raw/post-refinement/final counts, and the "clusters created" line shows how many clusters this run's region-aware splitting produced. Lower </w:t>
+      </w:r>
+      <w:r>
+        <w:rPr>
+          <w:rFonts w:ascii="Courier New" w:hAnsi="Courier New"/>
+          <w:color w:val="C0392B"/>
+          <w:sz w:val="18"/>
+        </w:rPr>
+        <w:t>hdbscan_region_split_impurity_thresh</w:t>
+      </w:r>
+      <w:r>
+        <w:rPr>
+          <w:b w:val="0"/>
+          <w:i w:val="0"/>
+        </w:rPr>
+        <w:t xml:space="preserve"> / </w:t>
+      </w:r>
+      <w:r>
+        <w:rPr>
+          <w:rFonts w:ascii="Courier New" w:hAnsi="Courier New"/>
+          <w:color w:val="C0392B"/>
+          <w:sz w:val="18"/>
+        </w:rPr>
+        <w:t>hdbscan_region_split_min_minority_frac</w:t>
+      </w:r>
+      <w:r>
+        <w:rPr>
+          <w:b w:val="0"/>
+          <w:i w:val="0"/>
+        </w:rPr>
+        <w:t xml:space="preserve"> if it looks too conservative, or raise them if it's over-splitting.</w:t>
       </w:r>
     </w:p>
     <w:p>

</xml_diff>